<commit_message>
Replace write-your-own task with 32 codes to crack
Twelve treble, twelve bass and eight mixed-clef codes (clef changes
mid-stave) in both the slides and the large-print worksheet. Adds a
key page to the worksheet and a separate teacher answer key. Removes
the write-your-own slide and worksheet page.

Co-Authored-By: Claude Sonnet 5.5 <noreply@anthropic.com>
Claude-Session: https://claude.ai/code/session_01ESBGYUe9qNtrpvApBi28BQ
</commit_message>
<xml_diff>
--- a/demo-materials/ClassroomBridge-CrackTheCode-Worksheet.docx
+++ b/demo-materials/ClassroomBridge-CrackTheCode-Worksheet.docx
@@ -24,7 +24,7 @@
                 <w:b/>
                 <w:sz w:val="68"/>
               </w:rPr>
-              <w:t>Crack the Code: Treble clef</w:t>
+              <w:t>Crack the Code: Your keys</w:t>
             </w:r>
           </w:p>
           <w:p>
@@ -34,7 +34,7 @@
                 <w:color w:val="C97C00"/>
                 <w:sz w:val="36"/>
               </w:rPr>
-              <w:t>Use the key. Write the letter in the box under each note.</w:t>
+              <w:t>Find the clef, match each note to the key, write its letter in the box.</w:t>
             </w:r>
           </w:p>
         </w:tc>
@@ -59,13 +59,26 @@
     </w:tbl>
     <w:p>
       <w:pPr>
-        <w:spacing w:after="0" w:before="160"/>
-        <w:jc w:val="center"/>
+        <w:spacing w:before="160" w:after="0"/>
+      </w:pPr>
+      <w:r>
+        <w:rPr>
+          <w:b/>
+          <w:i w:val="0"/>
+          <w:color w:val="C97C00"/>
+          <w:sz w:val="40"/>
+        </w:rPr>
+        <w:t>Treble clef key</w:t>
+      </w:r>
+    </w:p>
+    <w:p>
+      <w:pPr>
+        <w:spacing w:before="0" w:after="0"/>
       </w:pPr>
       <w:r>
         <w:drawing>
           <wp:inline xmlns:a="http://schemas.openxmlformats.org/drawingml/2006/main" xmlns:pic="http://schemas.openxmlformats.org/drawingml/2006/picture">
-            <wp:extent cx="6840000" cy="2193517"/>
+            <wp:extent cx="7560000" cy="2424414"/>
             <wp:docPr id="1" name="Picture 1"/>
             <wp:cNvGraphicFramePr>
               <a:graphicFrameLocks noChangeAspect="1"/>
@@ -86,7 +99,7 @@
                   <pic:spPr>
                     <a:xfrm>
                       <a:off x="0" y="0"/>
-                      <a:ext cx="6840000" cy="2193517"/>
+                      <a:ext cx="7560000" cy="2424414"/>
                     </a:xfrm>
                     <a:prstGeom prst="rect"/>
                   </pic:spPr>
@@ -99,13 +112,26 @@
     </w:p>
     <w:p>
       <w:pPr>
-        <w:spacing w:after="0" w:before="120"/>
-        <w:jc w:val="center"/>
+        <w:spacing w:before="160" w:after="0"/>
+      </w:pPr>
+      <w:r>
+        <w:rPr>
+          <w:b/>
+          <w:i w:val="0"/>
+          <w:color w:val="C97C00"/>
+          <w:sz w:val="40"/>
+        </w:rPr>
+        <w:t>Bass clef key</w:t>
+      </w:r>
+    </w:p>
+    <w:p>
+      <w:pPr>
+        <w:spacing w:before="0" w:after="0"/>
       </w:pPr>
       <w:r>
         <w:drawing>
           <wp:inline xmlns:a="http://schemas.openxmlformats.org/drawingml/2006/main" xmlns:pic="http://schemas.openxmlformats.org/drawingml/2006/picture">
-            <wp:extent cx="6300000" cy="3291573"/>
+            <wp:extent cx="7560000" cy="2220207"/>
             <wp:docPr id="2" name="Picture 2"/>
             <wp:cNvGraphicFramePr>
               <a:graphicFrameLocks noChangeAspect="1"/>
@@ -114,7 +140,7 @@
               <a:graphicData uri="http://schemas.openxmlformats.org/drawingml/2006/picture">
                 <pic:pic>
                   <pic:nvPicPr>
-                    <pic:cNvPr id="0" name="w1_badge.png"/>
+                    <pic:cNvPr id="0" name="key_bass.png"/>
                     <pic:cNvPicPr/>
                   </pic:nvPicPr>
                   <pic:blipFill>
@@ -126,7 +152,7 @@
                   <pic:spPr>
                     <a:xfrm>
                       <a:off x="0" y="0"/>
-                      <a:ext cx="6300000" cy="3291573"/>
+                      <a:ext cx="7560000" cy="2220207"/>
                     </a:xfrm>
                     <a:prstGeom prst="rect"/>
                   </pic:spPr>
@@ -136,7 +162,17 @@
           </wp:inline>
         </w:drawing>
       </w:r>
+    </w:p>
+    <w:p>
+      <w:pPr>
+        <w:rPr>
+          <w:sz w:val="2"/>
+        </w:rPr>
+      </w:pPr>
       <w:r>
+        <w:rPr>
+          <w:sz w:val="2"/>
+        </w:rPr>
         <w:br w:type="page"/>
       </w:r>
     </w:p>
@@ -162,7 +198,7 @@
                 <w:b/>
                 <w:sz w:val="68"/>
               </w:rPr>
-              <w:t>Crack the Code: Bass clef</w:t>
+              <w:t>Treble clef: codes 1 to 4</w:t>
             </w:r>
           </w:p>
           <w:p>
@@ -172,7 +208,7 @@
                 <w:color w:val="C97C00"/>
                 <w:sz w:val="36"/>
               </w:rPr>
-              <w:t>The notes move! Use the bass key this time.</w:t>
+              <w:t>Use the treble key. Write a letter in each box.</w:t>
             </w:r>
           </w:p>
         </w:tc>
@@ -197,84 +233,285 @@
     </w:tbl>
     <w:p>
       <w:pPr>
-        <w:spacing w:after="0" w:before="160"/>
-        <w:jc w:val="center"/>
+        <w:spacing w:before="0" w:after="0"/>
       </w:pPr>
       <w:r>
-        <w:drawing>
-          <wp:inline xmlns:a="http://schemas.openxmlformats.org/drawingml/2006/main" xmlns:pic="http://schemas.openxmlformats.org/drawingml/2006/picture">
-            <wp:extent cx="6840000" cy="2008759"/>
-            <wp:docPr id="3" name="Picture 3"/>
-            <wp:cNvGraphicFramePr>
-              <a:graphicFrameLocks noChangeAspect="1"/>
-            </wp:cNvGraphicFramePr>
-            <a:graphic>
-              <a:graphicData uri="http://schemas.openxmlformats.org/drawingml/2006/picture">
-                <pic:pic>
-                  <pic:nvPicPr>
-                    <pic:cNvPr id="0" name="key_bass.png"/>
-                    <pic:cNvPicPr/>
-                  </pic:nvPicPr>
-                  <pic:blipFill>
-                    <a:blip r:embed="rId11"/>
-                    <a:stretch>
-                      <a:fillRect/>
-                    </a:stretch>
-                  </pic:blipFill>
-                  <pic:spPr>
-                    <a:xfrm>
-                      <a:off x="0" y="0"/>
-                      <a:ext cx="6840000" cy="2008759"/>
-                    </a:xfrm>
-                    <a:prstGeom prst="rect"/>
-                  </pic:spPr>
-                </pic:pic>
-              </a:graphicData>
-            </a:graphic>
-          </wp:inline>
-        </w:drawing>
+        <w:rPr>
+          <w:b w:val="0"/>
+          <w:i w:val="0"/>
+          <w:color w:val="0F1B33"/>
+          <w:sz w:val="12"/>
+        </w:rPr>
+      </w:r>
+    </w:p>
+    <w:tbl>
+      <w:tblPr>
+        <w:tblW w:type="auto" w:w="0"/>
+        <w:tblLayout w:type="fixed"/>
+        <w:tblLook w:firstColumn="1" w:firstRow="1" w:lastColumn="0" w:lastRow="0" w:noHBand="0" w:noVBand="1" w:val="04A0"/>
+        <w:tblLayout w:type="fixed"/>
+      </w:tblPr>
+      <w:tblGrid>
+        <w:gridCol w:w="7540"/>
+        <w:gridCol w:w="7540"/>
+      </w:tblGrid>
+      <w:tr>
+        <w:tc>
+          <w:tcPr>
+            <w:tcW w:type="dxa" w:w="7540"/>
+          </w:tcPr>
+          <w:p>
+            <w:pPr>
+              <w:spacing w:before="120"/>
+            </w:pPr>
+            <w:r>
+              <w:rPr>
+                <w:b/>
+                <w:color w:val="C97C00"/>
+                <w:sz w:val="52"/>
+              </w:rPr>
+              <w:t>1</w:t>
+            </w:r>
+          </w:p>
+          <w:p>
+            <w:pPr>
+              <w:spacing w:before="40" w:after="0"/>
+            </w:pPr>
+            <w:r>
+              <w:drawing>
+                <wp:inline xmlns:a="http://schemas.openxmlformats.org/drawingml/2006/main" xmlns:pic="http://schemas.openxmlformats.org/drawingml/2006/picture">
+                  <wp:extent cx="2691870" cy="2051999"/>
+                  <wp:docPr id="3" name="Picture 3"/>
+                  <wp:cNvGraphicFramePr>
+                    <a:graphicFrameLocks noChangeAspect="1"/>
+                  </wp:cNvGraphicFramePr>
+                  <a:graphic>
+                    <a:graphicData uri="http://schemas.openxmlformats.org/drawingml/2006/picture">
+                      <pic:pic>
+                        <pic:nvPicPr>
+                          <pic:cNvPr id="0" name="t01.png"/>
+                          <pic:cNvPicPr/>
+                        </pic:nvPicPr>
+                        <pic:blipFill>
+                          <a:blip r:embed="rId11"/>
+                          <a:stretch>
+                            <a:fillRect/>
+                          </a:stretch>
+                        </pic:blipFill>
+                        <pic:spPr>
+                          <a:xfrm>
+                            <a:off x="0" y="0"/>
+                            <a:ext cx="2691870" cy="2051999"/>
+                          </a:xfrm>
+                          <a:prstGeom prst="rect"/>
+                        </pic:spPr>
+                      </pic:pic>
+                    </a:graphicData>
+                  </a:graphic>
+                </wp:inline>
+              </w:drawing>
+            </w:r>
+          </w:p>
+        </w:tc>
+        <w:tc>
+          <w:tcPr>
+            <w:tcW w:type="dxa" w:w="7540"/>
+          </w:tcPr>
+          <w:p>
+            <w:pPr>
+              <w:spacing w:before="120"/>
+            </w:pPr>
+            <w:r>
+              <w:rPr>
+                <w:b/>
+                <w:color w:val="C97C00"/>
+                <w:sz w:val="52"/>
+              </w:rPr>
+              <w:t>2</w:t>
+            </w:r>
+          </w:p>
+          <w:p>
+            <w:pPr>
+              <w:spacing w:before="40" w:after="0"/>
+            </w:pPr>
+            <w:r>
+              <w:drawing>
+                <wp:inline xmlns:a="http://schemas.openxmlformats.org/drawingml/2006/main" xmlns:pic="http://schemas.openxmlformats.org/drawingml/2006/picture">
+                  <wp:extent cx="2691870" cy="2051999"/>
+                  <wp:docPr id="4" name="Picture 4"/>
+                  <wp:cNvGraphicFramePr>
+                    <a:graphicFrameLocks noChangeAspect="1"/>
+                  </wp:cNvGraphicFramePr>
+                  <a:graphic>
+                    <a:graphicData uri="http://schemas.openxmlformats.org/drawingml/2006/picture">
+                      <pic:pic>
+                        <pic:nvPicPr>
+                          <pic:cNvPr id="0" name="t02.png"/>
+                          <pic:cNvPicPr/>
+                        </pic:nvPicPr>
+                        <pic:blipFill>
+                          <a:blip r:embed="rId12"/>
+                          <a:stretch>
+                            <a:fillRect/>
+                          </a:stretch>
+                        </pic:blipFill>
+                        <pic:spPr>
+                          <a:xfrm>
+                            <a:off x="0" y="0"/>
+                            <a:ext cx="2691870" cy="2051999"/>
+                          </a:xfrm>
+                          <a:prstGeom prst="rect"/>
+                        </pic:spPr>
+                      </pic:pic>
+                    </a:graphicData>
+                  </a:graphic>
+                </wp:inline>
+              </w:drawing>
+            </w:r>
+          </w:p>
+        </w:tc>
+      </w:tr>
+      <w:tr>
+        <w:tc>
+          <w:tcPr>
+            <w:tcW w:type="dxa" w:w="7540"/>
+          </w:tcPr>
+          <w:p>
+            <w:pPr>
+              <w:spacing w:before="120"/>
+            </w:pPr>
+            <w:r>
+              <w:rPr>
+                <w:b/>
+                <w:color w:val="C97C00"/>
+                <w:sz w:val="52"/>
+              </w:rPr>
+              <w:t>3</w:t>
+            </w:r>
+          </w:p>
+          <w:p>
+            <w:pPr>
+              <w:spacing w:before="40" w:after="0"/>
+            </w:pPr>
+            <w:r>
+              <w:drawing>
+                <wp:inline xmlns:a="http://schemas.openxmlformats.org/drawingml/2006/main" xmlns:pic="http://schemas.openxmlformats.org/drawingml/2006/picture">
+                  <wp:extent cx="2691870" cy="2051999"/>
+                  <wp:docPr id="5" name="Picture 5"/>
+                  <wp:cNvGraphicFramePr>
+                    <a:graphicFrameLocks noChangeAspect="1"/>
+                  </wp:cNvGraphicFramePr>
+                  <a:graphic>
+                    <a:graphicData uri="http://schemas.openxmlformats.org/drawingml/2006/picture">
+                      <pic:pic>
+                        <pic:nvPicPr>
+                          <pic:cNvPr id="0" name="t03.png"/>
+                          <pic:cNvPicPr/>
+                        </pic:nvPicPr>
+                        <pic:blipFill>
+                          <a:blip r:embed="rId13"/>
+                          <a:stretch>
+                            <a:fillRect/>
+                          </a:stretch>
+                        </pic:blipFill>
+                        <pic:spPr>
+                          <a:xfrm>
+                            <a:off x="0" y="0"/>
+                            <a:ext cx="2691870" cy="2051999"/>
+                          </a:xfrm>
+                          <a:prstGeom prst="rect"/>
+                        </pic:spPr>
+                      </pic:pic>
+                    </a:graphicData>
+                  </a:graphic>
+                </wp:inline>
+              </w:drawing>
+            </w:r>
+          </w:p>
+        </w:tc>
+        <w:tc>
+          <w:tcPr>
+            <w:tcW w:type="dxa" w:w="7540"/>
+          </w:tcPr>
+          <w:p>
+            <w:pPr>
+              <w:spacing w:before="120"/>
+            </w:pPr>
+            <w:r>
+              <w:rPr>
+                <w:b/>
+                <w:color w:val="C97C00"/>
+                <w:sz w:val="52"/>
+              </w:rPr>
+              <w:t>4</w:t>
+            </w:r>
+          </w:p>
+          <w:p>
+            <w:pPr>
+              <w:spacing w:before="40" w:after="0"/>
+            </w:pPr>
+            <w:r>
+              <w:drawing>
+                <wp:inline xmlns:a="http://schemas.openxmlformats.org/drawingml/2006/main" xmlns:pic="http://schemas.openxmlformats.org/drawingml/2006/picture">
+                  <wp:extent cx="2691870" cy="2051999"/>
+                  <wp:docPr id="6" name="Picture 6"/>
+                  <wp:cNvGraphicFramePr>
+                    <a:graphicFrameLocks noChangeAspect="1"/>
+                  </wp:cNvGraphicFramePr>
+                  <a:graphic>
+                    <a:graphicData uri="http://schemas.openxmlformats.org/drawingml/2006/picture">
+                      <pic:pic>
+                        <pic:nvPicPr>
+                          <pic:cNvPr id="0" name="t04.png"/>
+                          <pic:cNvPicPr/>
+                        </pic:nvPicPr>
+                        <pic:blipFill>
+                          <a:blip r:embed="rId14"/>
+                          <a:stretch>
+                            <a:fillRect/>
+                          </a:stretch>
+                        </pic:blipFill>
+                        <pic:spPr>
+                          <a:xfrm>
+                            <a:off x="0" y="0"/>
+                            <a:ext cx="2691870" cy="2051999"/>
+                          </a:xfrm>
+                          <a:prstGeom prst="rect"/>
+                        </pic:spPr>
+                      </pic:pic>
+                    </a:graphicData>
+                  </a:graphic>
+                </wp:inline>
+              </w:drawing>
+            </w:r>
+          </w:p>
+        </w:tc>
+      </w:tr>
+    </w:tbl>
+    <w:p>
+      <w:pPr>
+        <w:spacing w:before="120" w:after="0"/>
+      </w:pPr>
+      <w:r>
+        <w:rPr>
+          <w:b w:val="0"/>
+          <w:i/>
+          <w:color w:val="0F1B33"/>
+          <w:sz w:val="28"/>
+        </w:rPr>
+        <w:t>Treble key:  lines E G B D F  |  spaces F A C E</w:t>
       </w:r>
     </w:p>
     <w:p>
       <w:pPr>
-        <w:spacing w:after="0" w:before="120"/>
-        <w:jc w:val="center"/>
+        <w:rPr>
+          <w:sz w:val="2"/>
+        </w:rPr>
       </w:pPr>
       <w:r>
-        <w:drawing>
-          <wp:inline xmlns:a="http://schemas.openxmlformats.org/drawingml/2006/main" xmlns:pic="http://schemas.openxmlformats.org/drawingml/2006/picture">
-            <wp:extent cx="7560000" cy="2960388"/>
-            <wp:docPr id="4" name="Picture 4"/>
-            <wp:cNvGraphicFramePr>
-              <a:graphicFrameLocks noChangeAspect="1"/>
-            </wp:cNvGraphicFramePr>
-            <a:graphic>
-              <a:graphicData uri="http://schemas.openxmlformats.org/drawingml/2006/picture">
-                <pic:pic>
-                  <pic:nvPicPr>
-                    <pic:cNvPr id="0" name="w2_decade.png"/>
-                    <pic:cNvPicPr/>
-                  </pic:nvPicPr>
-                  <pic:blipFill>
-                    <a:blip r:embed="rId12"/>
-                    <a:stretch>
-                      <a:fillRect/>
-                    </a:stretch>
-                  </pic:blipFill>
-                  <pic:spPr>
-                    <a:xfrm>
-                      <a:off x="0" y="0"/>
-                      <a:ext cx="7560000" cy="2960388"/>
-                    </a:xfrm>
-                    <a:prstGeom prst="rect"/>
-                  </pic:spPr>
-                </pic:pic>
-              </a:graphicData>
-            </a:graphic>
-          </wp:inline>
-        </w:drawing>
-      </w:r>
-      <w:r>
+        <w:rPr>
+          <w:sz w:val="2"/>
+        </w:rPr>
         <w:br w:type="page"/>
       </w:r>
     </w:p>
@@ -300,7 +537,7 @@
                 <w:b/>
                 <w:sz w:val="68"/>
               </w:rPr>
-              <w:t>Crack the Code: Two clefs</w:t>
+              <w:t>Treble clef: codes 5 to 8</w:t>
             </w:r>
           </w:p>
           <w:p>
@@ -310,7 +547,7 @@
                 <w:color w:val="C97C00"/>
                 <w:sz w:val="36"/>
               </w:rPr>
-              <w:t>Two words, one message. Check the clef each time!</w:t>
+              <w:t>Use the treble key. Write a letter in each box.</w:t>
             </w:r>
           </w:p>
         </w:tc>
@@ -335,8 +572,16 @@
     </w:tbl>
     <w:p>
       <w:pPr>
-        <w:spacing w:after="0" w:before="0"/>
+        <w:spacing w:before="0" w:after="0"/>
       </w:pPr>
+      <w:r>
+        <w:rPr>
+          <w:b w:val="0"/>
+          <w:i w:val="0"/>
+          <w:color w:val="0F1B33"/>
+          <w:sz w:val="12"/>
+        </w:rPr>
+      </w:r>
     </w:p>
     <w:tbl>
       <w:tblPr>
@@ -355,21 +600,27 @@
             <w:tcW w:type="dxa" w:w="7540"/>
           </w:tcPr>
           <w:p>
+            <w:pPr>
+              <w:spacing w:before="120"/>
+            </w:pPr>
             <w:r>
               <w:rPr>
                 <w:b/>
                 <w:color w:val="C97C00"/>
-                <w:sz w:val="40"/>
+                <w:sz w:val="52"/>
               </w:rPr>
-              <w:t>Treble clef (use the treble key)</w:t>
+              <w:t>5</w:t>
             </w:r>
           </w:p>
           <w:p>
+            <w:pPr>
+              <w:spacing w:before="40" w:after="0"/>
+            </w:pPr>
             <w:r>
               <w:drawing>
                 <wp:inline xmlns:a="http://schemas.openxmlformats.org/drawingml/2006/main" xmlns:pic="http://schemas.openxmlformats.org/drawingml/2006/picture">
-                  <wp:extent cx="4536000" cy="2812320"/>
-                  <wp:docPr id="5" name="Picture 5"/>
+                  <wp:extent cx="3309677" cy="2052000"/>
+                  <wp:docPr id="7" name="Picture 7"/>
                   <wp:cNvGraphicFramePr>
                     <a:graphicFrameLocks noChangeAspect="1"/>
                   </wp:cNvGraphicFramePr>
@@ -377,11 +628,11 @@
                     <a:graphicData uri="http://schemas.openxmlformats.org/drawingml/2006/picture">
                       <pic:pic>
                         <pic:nvPicPr>
-                          <pic:cNvPr id="0" name="w3a_cage.png"/>
+                          <pic:cNvPr id="0" name="t05.png"/>
                           <pic:cNvPicPr/>
                         </pic:nvPicPr>
                         <pic:blipFill>
-                          <a:blip r:embed="rId13"/>
+                          <a:blip r:embed="rId15"/>
                           <a:stretch>
                             <a:fillRect/>
                           </a:stretch>
@@ -389,7 +640,7 @@
                         <pic:spPr>
                           <a:xfrm>
                             <a:off x="0" y="0"/>
-                            <a:ext cx="4536000" cy="2812320"/>
+                            <a:ext cx="3309677" cy="2052000"/>
                           </a:xfrm>
                           <a:prstGeom prst="rect"/>
                         </pic:spPr>
@@ -406,21 +657,27 @@
             <w:tcW w:type="dxa" w:w="7540"/>
           </w:tcPr>
           <w:p>
+            <w:pPr>
+              <w:spacing w:before="120"/>
+            </w:pPr>
             <w:r>
               <w:rPr>
                 <w:b/>
                 <w:color w:val="C97C00"/>
-                <w:sz w:val="40"/>
+                <w:sz w:val="52"/>
               </w:rPr>
-              <w:t>Bass clef (use the bass key)</w:t>
+              <w:t>6</w:t>
             </w:r>
           </w:p>
           <w:p>
+            <w:pPr>
+              <w:spacing w:before="40" w:after="0"/>
+            </w:pPr>
             <w:r>
               <w:drawing>
                 <wp:inline xmlns:a="http://schemas.openxmlformats.org/drawingml/2006/main" xmlns:pic="http://schemas.openxmlformats.org/drawingml/2006/picture">
-                  <wp:extent cx="4536000" cy="2439360"/>
-                  <wp:docPr id="6" name="Picture 6"/>
+                  <wp:extent cx="3309677" cy="2052000"/>
+                  <wp:docPr id="8" name="Picture 8"/>
                   <wp:cNvGraphicFramePr>
                     <a:graphicFrameLocks noChangeAspect="1"/>
                   </wp:cNvGraphicFramePr>
@@ -428,11 +685,11 @@
                     <a:graphicData uri="http://schemas.openxmlformats.org/drawingml/2006/picture">
                       <pic:pic>
                         <pic:nvPicPr>
-                          <pic:cNvPr id="0" name="w3b_feed.png"/>
+                          <pic:cNvPr id="0" name="t06.png"/>
                           <pic:cNvPicPr/>
                         </pic:nvPicPr>
                         <pic:blipFill>
-                          <a:blip r:embed="rId14"/>
+                          <a:blip r:embed="rId16"/>
                           <a:stretch>
                             <a:fillRect/>
                           </a:stretch>
@@ -440,7 +697,123 @@
                         <pic:spPr>
                           <a:xfrm>
                             <a:off x="0" y="0"/>
-                            <a:ext cx="4536000" cy="2439360"/>
+                            <a:ext cx="3309677" cy="2052000"/>
+                          </a:xfrm>
+                          <a:prstGeom prst="rect"/>
+                        </pic:spPr>
+                      </pic:pic>
+                    </a:graphicData>
+                  </a:graphic>
+                </wp:inline>
+              </w:drawing>
+            </w:r>
+          </w:p>
+        </w:tc>
+      </w:tr>
+      <w:tr>
+        <w:tc>
+          <w:tcPr>
+            <w:tcW w:type="dxa" w:w="7540"/>
+          </w:tcPr>
+          <w:p>
+            <w:pPr>
+              <w:spacing w:before="120"/>
+            </w:pPr>
+            <w:r>
+              <w:rPr>
+                <w:b/>
+                <w:color w:val="C97C00"/>
+                <w:sz w:val="52"/>
+              </w:rPr>
+              <w:t>7</w:t>
+            </w:r>
+          </w:p>
+          <w:p>
+            <w:pPr>
+              <w:spacing w:before="40" w:after="0"/>
+            </w:pPr>
+            <w:r>
+              <w:drawing>
+                <wp:inline xmlns:a="http://schemas.openxmlformats.org/drawingml/2006/main" xmlns:pic="http://schemas.openxmlformats.org/drawingml/2006/picture">
+                  <wp:extent cx="3309677" cy="2052000"/>
+                  <wp:docPr id="9" name="Picture 9"/>
+                  <wp:cNvGraphicFramePr>
+                    <a:graphicFrameLocks noChangeAspect="1"/>
+                  </wp:cNvGraphicFramePr>
+                  <a:graphic>
+                    <a:graphicData uri="http://schemas.openxmlformats.org/drawingml/2006/picture">
+                      <pic:pic>
+                        <pic:nvPicPr>
+                          <pic:cNvPr id="0" name="t07.png"/>
+                          <pic:cNvPicPr/>
+                        </pic:nvPicPr>
+                        <pic:blipFill>
+                          <a:blip r:embed="rId17"/>
+                          <a:stretch>
+                            <a:fillRect/>
+                          </a:stretch>
+                        </pic:blipFill>
+                        <pic:spPr>
+                          <a:xfrm>
+                            <a:off x="0" y="0"/>
+                            <a:ext cx="3309677" cy="2052000"/>
+                          </a:xfrm>
+                          <a:prstGeom prst="rect"/>
+                        </pic:spPr>
+                      </pic:pic>
+                    </a:graphicData>
+                  </a:graphic>
+                </wp:inline>
+              </w:drawing>
+            </w:r>
+          </w:p>
+        </w:tc>
+        <w:tc>
+          <w:tcPr>
+            <w:tcW w:type="dxa" w:w="7540"/>
+          </w:tcPr>
+          <w:p>
+            <w:pPr>
+              <w:spacing w:before="120"/>
+            </w:pPr>
+            <w:r>
+              <w:rPr>
+                <w:b/>
+                <w:color w:val="C97C00"/>
+                <w:sz w:val="52"/>
+              </w:rPr>
+              <w:t>8</w:t>
+            </w:r>
+          </w:p>
+          <w:p>
+            <w:pPr>
+              <w:spacing w:before="40" w:after="0"/>
+            </w:pPr>
+            <w:r>
+              <w:drawing>
+                <wp:inline xmlns:a="http://schemas.openxmlformats.org/drawingml/2006/main" xmlns:pic="http://schemas.openxmlformats.org/drawingml/2006/picture">
+                  <wp:extent cx="3309677" cy="2052000"/>
+                  <wp:docPr id="10" name="Picture 10"/>
+                  <wp:cNvGraphicFramePr>
+                    <a:graphicFrameLocks noChangeAspect="1"/>
+                  </wp:cNvGraphicFramePr>
+                  <a:graphic>
+                    <a:graphicData uri="http://schemas.openxmlformats.org/drawingml/2006/picture">
+                      <pic:pic>
+                        <pic:nvPicPr>
+                          <pic:cNvPr id="0" name="t08.png"/>
+                          <pic:cNvPicPr/>
+                        </pic:nvPicPr>
+                        <pic:blipFill>
+                          <a:blip r:embed="rId18"/>
+                          <a:stretch>
+                            <a:fillRect/>
+                          </a:stretch>
+                        </pic:blipFill>
+                        <pic:spPr>
+                          <a:xfrm>
+                            <a:off x="0" y="0"/>
+                            <a:ext cx="3309677" cy="2052000"/>
                           </a:xfrm>
                           <a:prstGeom prst="rect"/>
                         </pic:spPr>
@@ -456,9 +829,28 @@
     </w:tbl>
     <w:p>
       <w:pPr>
-        <w:spacing w:after="0"/>
+        <w:spacing w:before="120" w:after="0"/>
       </w:pPr>
       <w:r>
+        <w:rPr>
+          <w:b w:val="0"/>
+          <w:i/>
+          <w:color w:val="0F1B33"/>
+          <w:sz w:val="28"/>
+        </w:rPr>
+        <w:t>Treble key:  lines E G B D F  |  spaces F A C E</w:t>
+      </w:r>
+    </w:p>
+    <w:p>
+      <w:pPr>
+        <w:rPr>
+          <w:sz w:val="2"/>
+        </w:rPr>
+      </w:pPr>
+      <w:r>
+        <w:rPr>
+          <w:sz w:val="2"/>
+        </w:rPr>
         <w:br w:type="page"/>
       </w:r>
     </w:p>
@@ -484,7 +876,7 @@
                 <w:b/>
                 <w:sz w:val="68"/>
               </w:rPr>
-              <w:t>Write your own code</w:t>
+              <w:t>Treble clef: codes 9 to 12</w:t>
             </w:r>
           </w:p>
           <w:p>
@@ -494,7 +886,7 @@
                 <w:color w:val="C97C00"/>
                 <w:sz w:val="36"/>
               </w:rPr>
-              <w:t>Make a word for a partner to crack.</w:t>
+              <w:t>Use the treble key. Write a letter in each box.</w:t>
             </w:r>
           </w:p>
         </w:tc>
@@ -519,41 +911,15 @@
     </w:tbl>
     <w:p>
       <w:pPr>
-        <w:spacing w:after="0" w:before="200"/>
+        <w:spacing w:before="0" w:after="0"/>
       </w:pPr>
       <w:r>
         <w:rPr>
           <w:b w:val="0"/>
+          <w:i w:val="0"/>
           <w:color w:val="0F1B33"/>
-          <w:sz w:val="40"/>
+          <w:sz w:val="12"/>
         </w:rPr>
-        <w:t>1  Pick a word that uses only the letters A to G.</w:t>
-      </w:r>
-    </w:p>
-    <w:p>
-      <w:pPr>
-        <w:spacing w:after="0" w:before="40"/>
-      </w:pPr>
-      <w:r>
-        <w:rPr>
-          <w:b w:val="0"/>
-          <w:color w:val="0F1B33"/>
-          <w:sz w:val="40"/>
-        </w:rPr>
-        <w:t>2  Draw its notes on a stave: open ovals on a line or in a space.</w:t>
-      </w:r>
-    </w:p>
-    <w:p>
-      <w:pPr>
-        <w:spacing w:after="160" w:before="40"/>
-      </w:pPr>
-      <w:r>
-        <w:rPr>
-          <w:b w:val="0"/>
-          <w:color w:val="0F1B33"/>
-          <w:sz w:val="40"/>
-        </w:rPr>
-        <w:t>3  Swap with a partner. Can they crack it?</w:t>
       </w:r>
     </w:p>
     <w:tbl>
@@ -573,21 +939,27 @@
             <w:tcW w:type="dxa" w:w="7540"/>
           </w:tcPr>
           <w:p>
+            <w:pPr>
+              <w:spacing w:before="120"/>
+            </w:pPr>
             <w:r>
               <w:rPr>
                 <w:b/>
                 <w:color w:val="C97C00"/>
-                <w:sz w:val="40"/>
+                <w:sz w:val="52"/>
               </w:rPr>
-              <w:t>Treble clef</w:t>
+              <w:t>9</w:t>
             </w:r>
           </w:p>
           <w:p>
+            <w:pPr>
+              <w:spacing w:before="40" w:after="0"/>
+            </w:pPr>
             <w:r>
               <w:drawing>
                 <wp:inline xmlns:a="http://schemas.openxmlformats.org/drawingml/2006/main" xmlns:pic="http://schemas.openxmlformats.org/drawingml/2006/picture">
-                  <wp:extent cx="4536000" cy="2047806"/>
-                  <wp:docPr id="7" name="Picture 7"/>
+                  <wp:extent cx="3309677" cy="2052000"/>
+                  <wp:docPr id="11" name="Picture 11"/>
                   <wp:cNvGraphicFramePr>
                     <a:graphicFrameLocks noChangeAspect="1"/>
                   </wp:cNvGraphicFramePr>
@@ -595,11 +967,11 @@
                     <a:graphicData uri="http://schemas.openxmlformats.org/drawingml/2006/picture">
                       <pic:pic>
                         <pic:nvPicPr>
-                          <pic:cNvPr id="0" name="blank_treble.png"/>
+                          <pic:cNvPr id="0" name="t09.png"/>
                           <pic:cNvPicPr/>
                         </pic:nvPicPr>
                         <pic:blipFill>
-                          <a:blip r:embed="rId15"/>
+                          <a:blip r:embed="rId19"/>
                           <a:stretch>
                             <a:fillRect/>
                           </a:stretch>
@@ -607,7 +979,7 @@
                         <pic:spPr>
                           <a:xfrm>
                             <a:off x="0" y="0"/>
-                            <a:ext cx="4536000" cy="2047806"/>
+                            <a:ext cx="3309677" cy="2052000"/>
                           </a:xfrm>
                           <a:prstGeom prst="rect"/>
                         </pic:spPr>
@@ -624,21 +996,27 @@
             <w:tcW w:type="dxa" w:w="7540"/>
           </w:tcPr>
           <w:p>
+            <w:pPr>
+              <w:spacing w:before="120"/>
+            </w:pPr>
             <w:r>
               <w:rPr>
                 <w:b/>
                 <w:color w:val="C97C00"/>
-                <w:sz w:val="40"/>
+                <w:sz w:val="52"/>
               </w:rPr>
-              <w:t>Bass clef</w:t>
+              <w:t>10</w:t>
             </w:r>
           </w:p>
           <w:p>
+            <w:pPr>
+              <w:spacing w:before="40" w:after="0"/>
+            </w:pPr>
             <w:r>
               <w:drawing>
                 <wp:inline xmlns:a="http://schemas.openxmlformats.org/drawingml/2006/main" xmlns:pic="http://schemas.openxmlformats.org/drawingml/2006/picture">
-                  <wp:extent cx="4536000" cy="1776233"/>
-                  <wp:docPr id="8" name="Picture 8"/>
+                  <wp:extent cx="3927483" cy="2052000"/>
+                  <wp:docPr id="12" name="Picture 12"/>
                   <wp:cNvGraphicFramePr>
                     <a:graphicFrameLocks noChangeAspect="1"/>
                   </wp:cNvGraphicFramePr>
@@ -646,11 +1024,11 @@
                     <a:graphicData uri="http://schemas.openxmlformats.org/drawingml/2006/picture">
                       <pic:pic>
                         <pic:nvPicPr>
-                          <pic:cNvPr id="0" name="blank_bass.png"/>
+                          <pic:cNvPr id="0" name="t10.png"/>
                           <pic:cNvPicPr/>
                         </pic:nvPicPr>
                         <pic:blipFill>
-                          <a:blip r:embed="rId16"/>
+                          <a:blip r:embed="rId20"/>
                           <a:stretch>
                             <a:fillRect/>
                           </a:stretch>
@@ -658,7 +1036,123 @@
                         <pic:spPr>
                           <a:xfrm>
                             <a:off x="0" y="0"/>
-                            <a:ext cx="4536000" cy="1776233"/>
+                            <a:ext cx="3927483" cy="2052000"/>
+                          </a:xfrm>
+                          <a:prstGeom prst="rect"/>
+                        </pic:spPr>
+                      </pic:pic>
+                    </a:graphicData>
+                  </a:graphic>
+                </wp:inline>
+              </w:drawing>
+            </w:r>
+          </w:p>
+        </w:tc>
+      </w:tr>
+      <w:tr>
+        <w:tc>
+          <w:tcPr>
+            <w:tcW w:type="dxa" w:w="7540"/>
+          </w:tcPr>
+          <w:p>
+            <w:pPr>
+              <w:spacing w:before="120"/>
+            </w:pPr>
+            <w:r>
+              <w:rPr>
+                <w:b/>
+                <w:color w:val="C97C00"/>
+                <w:sz w:val="52"/>
+              </w:rPr>
+              <w:t>11</w:t>
+            </w:r>
+          </w:p>
+          <w:p>
+            <w:pPr>
+              <w:spacing w:before="40" w:after="0"/>
+            </w:pPr>
+            <w:r>
+              <w:drawing>
+                <wp:inline xmlns:a="http://schemas.openxmlformats.org/drawingml/2006/main" xmlns:pic="http://schemas.openxmlformats.org/drawingml/2006/picture">
+                  <wp:extent cx="4392000" cy="1982796"/>
+                  <wp:docPr id="13" name="Picture 13"/>
+                  <wp:cNvGraphicFramePr>
+                    <a:graphicFrameLocks noChangeAspect="1"/>
+                  </wp:cNvGraphicFramePr>
+                  <a:graphic>
+                    <a:graphicData uri="http://schemas.openxmlformats.org/drawingml/2006/picture">
+                      <pic:pic>
+                        <pic:nvPicPr>
+                          <pic:cNvPr id="0" name="t11.png"/>
+                          <pic:cNvPicPr/>
+                        </pic:nvPicPr>
+                        <pic:blipFill>
+                          <a:blip r:embed="rId21"/>
+                          <a:stretch>
+                            <a:fillRect/>
+                          </a:stretch>
+                        </pic:blipFill>
+                        <pic:spPr>
+                          <a:xfrm>
+                            <a:off x="0" y="0"/>
+                            <a:ext cx="4392000" cy="1982796"/>
+                          </a:xfrm>
+                          <a:prstGeom prst="rect"/>
+                        </pic:spPr>
+                      </pic:pic>
+                    </a:graphicData>
+                  </a:graphic>
+                </wp:inline>
+              </w:drawing>
+            </w:r>
+          </w:p>
+        </w:tc>
+        <w:tc>
+          <w:tcPr>
+            <w:tcW w:type="dxa" w:w="7540"/>
+          </w:tcPr>
+          <w:p>
+            <w:pPr>
+              <w:spacing w:before="120"/>
+            </w:pPr>
+            <w:r>
+              <w:rPr>
+                <w:b/>
+                <w:color w:val="C97C00"/>
+                <w:sz w:val="52"/>
+              </w:rPr>
+              <w:t>12</w:t>
+            </w:r>
+          </w:p>
+          <w:p>
+            <w:pPr>
+              <w:spacing w:before="40" w:after="0"/>
+            </w:pPr>
+            <w:r>
+              <w:drawing>
+                <wp:inline xmlns:a="http://schemas.openxmlformats.org/drawingml/2006/main" xmlns:pic="http://schemas.openxmlformats.org/drawingml/2006/picture">
+                  <wp:extent cx="4392000" cy="1982796"/>
+                  <wp:docPr id="14" name="Picture 14"/>
+                  <wp:cNvGraphicFramePr>
+                    <a:graphicFrameLocks noChangeAspect="1"/>
+                  </wp:cNvGraphicFramePr>
+                  <a:graphic>
+                    <a:graphicData uri="http://schemas.openxmlformats.org/drawingml/2006/picture">
+                      <pic:pic>
+                        <pic:nvPicPr>
+                          <pic:cNvPr id="0" name="t12.png"/>
+                          <pic:cNvPicPr/>
+                        </pic:nvPicPr>
+                        <pic:blipFill>
+                          <a:blip r:embed="rId22"/>
+                          <a:stretch>
+                            <a:fillRect/>
+                          </a:stretch>
+                        </pic:blipFill>
+                        <pic:spPr>
+                          <a:xfrm>
+                            <a:off x="0" y="0"/>
+                            <a:ext cx="4392000" cy="1982796"/>
                           </a:xfrm>
                           <a:prstGeom prst="rect"/>
                         </pic:spPr>
@@ -672,6 +1166,1977 @@
         </w:tc>
       </w:tr>
     </w:tbl>
+    <w:p>
+      <w:pPr>
+        <w:spacing w:before="120" w:after="0"/>
+      </w:pPr>
+      <w:r>
+        <w:rPr>
+          <w:b w:val="0"/>
+          <w:i/>
+          <w:color w:val="0F1B33"/>
+          <w:sz w:val="28"/>
+        </w:rPr>
+        <w:t>Treble key:  lines E G B D F  |  spaces F A C E</w:t>
+      </w:r>
+    </w:p>
+    <w:p>
+      <w:pPr>
+        <w:rPr>
+          <w:sz w:val="2"/>
+        </w:rPr>
+      </w:pPr>
+      <w:r>
+        <w:rPr>
+          <w:sz w:val="2"/>
+        </w:rPr>
+        <w:br w:type="page"/>
+      </w:r>
+    </w:p>
+    <w:tbl>
+      <w:tblPr>
+        <w:tblW w:type="auto" w:w="0"/>
+        <w:tblLayout w:type="fixed"/>
+        <w:tblLook w:firstColumn="1" w:firstRow="1" w:lastColumn="0" w:lastRow="0" w:noHBand="0" w:noVBand="1" w:val="04A0"/>
+        <w:tblLayout w:type="fixed"/>
+      </w:tblPr>
+      <w:tblGrid>
+        <w:gridCol w:w="10318"/>
+        <w:gridCol w:w="4819"/>
+      </w:tblGrid>
+      <w:tr>
+        <w:tc>
+          <w:tcPr>
+            <w:tcW w:type="dxa" w:w="10318"/>
+          </w:tcPr>
+          <w:p>
+            <w:r>
+              <w:rPr>
+                <w:b/>
+                <w:sz w:val="68"/>
+              </w:rPr>
+              <w:t>Bass clef: codes 1 to 4</w:t>
+            </w:r>
+          </w:p>
+          <w:p>
+            <w:r>
+              <w:rPr>
+                <w:b/>
+                <w:color w:val="C97C00"/>
+                <w:sz w:val="36"/>
+              </w:rPr>
+              <w:t>Use the bass key. Remember the notes move!</w:t>
+            </w:r>
+          </w:p>
+        </w:tc>
+        <w:tc>
+          <w:tcPr>
+            <w:tcW w:type="dxa" w:w="4819"/>
+          </w:tcPr>
+          <w:p>
+            <w:pPr>
+              <w:spacing w:before="200"/>
+              <w:jc w:val="right"/>
+            </w:pPr>
+            <w:r>
+              <w:rPr>
+                <w:sz w:val="40"/>
+              </w:rPr>
+              <w:t>Name: ______________</w:t>
+            </w:r>
+          </w:p>
+        </w:tc>
+      </w:tr>
+    </w:tbl>
+    <w:p>
+      <w:pPr>
+        <w:spacing w:before="0" w:after="0"/>
+      </w:pPr>
+      <w:r>
+        <w:rPr>
+          <w:b w:val="0"/>
+          <w:i w:val="0"/>
+          <w:color w:val="0F1B33"/>
+          <w:sz w:val="12"/>
+        </w:rPr>
+      </w:r>
+    </w:p>
+    <w:tbl>
+      <w:tblPr>
+        <w:tblW w:type="auto" w:w="0"/>
+        <w:tblLayout w:type="fixed"/>
+        <w:tblLook w:firstColumn="1" w:firstRow="1" w:lastColumn="0" w:lastRow="0" w:noHBand="0" w:noVBand="1" w:val="04A0"/>
+        <w:tblLayout w:type="fixed"/>
+      </w:tblPr>
+      <w:tblGrid>
+        <w:gridCol w:w="7540"/>
+        <w:gridCol w:w="7540"/>
+      </w:tblGrid>
+      <w:tr>
+        <w:tc>
+          <w:tcPr>
+            <w:tcW w:type="dxa" w:w="7540"/>
+          </w:tcPr>
+          <w:p>
+            <w:pPr>
+              <w:spacing w:before="120"/>
+            </w:pPr>
+            <w:r>
+              <w:rPr>
+                <w:b/>
+                <w:color w:val="C97C00"/>
+                <w:sz w:val="52"/>
+              </w:rPr>
+              <w:t>1</w:t>
+            </w:r>
+          </w:p>
+          <w:p>
+            <w:pPr>
+              <w:spacing w:before="40" w:after="0"/>
+            </w:pPr>
+            <w:r>
+              <w:drawing>
+                <wp:inline xmlns:a="http://schemas.openxmlformats.org/drawingml/2006/main" xmlns:pic="http://schemas.openxmlformats.org/drawingml/2006/picture">
+                  <wp:extent cx="3103438" cy="2052000"/>
+                  <wp:docPr id="15" name="Picture 15"/>
+                  <wp:cNvGraphicFramePr>
+                    <a:graphicFrameLocks noChangeAspect="1"/>
+                  </wp:cNvGraphicFramePr>
+                  <a:graphic>
+                    <a:graphicData uri="http://schemas.openxmlformats.org/drawingml/2006/picture">
+                      <pic:pic>
+                        <pic:nvPicPr>
+                          <pic:cNvPr id="0" name="b01.png"/>
+                          <pic:cNvPicPr/>
+                        </pic:nvPicPr>
+                        <pic:blipFill>
+                          <a:blip r:embed="rId23"/>
+                          <a:stretch>
+                            <a:fillRect/>
+                          </a:stretch>
+                        </pic:blipFill>
+                        <pic:spPr>
+                          <a:xfrm>
+                            <a:off x="0" y="0"/>
+                            <a:ext cx="3103438" cy="2052000"/>
+                          </a:xfrm>
+                          <a:prstGeom prst="rect"/>
+                        </pic:spPr>
+                      </pic:pic>
+                    </a:graphicData>
+                  </a:graphic>
+                </wp:inline>
+              </w:drawing>
+            </w:r>
+          </w:p>
+        </w:tc>
+        <w:tc>
+          <w:tcPr>
+            <w:tcW w:type="dxa" w:w="7540"/>
+          </w:tcPr>
+          <w:p>
+            <w:pPr>
+              <w:spacing w:before="120"/>
+            </w:pPr>
+            <w:r>
+              <w:rPr>
+                <w:b/>
+                <w:color w:val="C97C00"/>
+                <w:sz w:val="52"/>
+              </w:rPr>
+              <w:t>2</w:t>
+            </w:r>
+          </w:p>
+          <w:p>
+            <w:pPr>
+              <w:spacing w:before="40" w:after="0"/>
+            </w:pPr>
+            <w:r>
+              <w:drawing>
+                <wp:inline xmlns:a="http://schemas.openxmlformats.org/drawingml/2006/main" xmlns:pic="http://schemas.openxmlformats.org/drawingml/2006/picture">
+                  <wp:extent cx="2939459" cy="2051999"/>
+                  <wp:docPr id="16" name="Picture 16"/>
+                  <wp:cNvGraphicFramePr>
+                    <a:graphicFrameLocks noChangeAspect="1"/>
+                  </wp:cNvGraphicFramePr>
+                  <a:graphic>
+                    <a:graphicData uri="http://schemas.openxmlformats.org/drawingml/2006/picture">
+                      <pic:pic>
+                        <pic:nvPicPr>
+                          <pic:cNvPr id="0" name="b02.png"/>
+                          <pic:cNvPicPr/>
+                        </pic:nvPicPr>
+                        <pic:blipFill>
+                          <a:blip r:embed="rId24"/>
+                          <a:stretch>
+                            <a:fillRect/>
+                          </a:stretch>
+                        </pic:blipFill>
+                        <pic:spPr>
+                          <a:xfrm>
+                            <a:off x="0" y="0"/>
+                            <a:ext cx="2939459" cy="2051999"/>
+                          </a:xfrm>
+                          <a:prstGeom prst="rect"/>
+                        </pic:spPr>
+                      </pic:pic>
+                    </a:graphicData>
+                  </a:graphic>
+                </wp:inline>
+              </w:drawing>
+            </w:r>
+          </w:p>
+        </w:tc>
+      </w:tr>
+      <w:tr>
+        <w:tc>
+          <w:tcPr>
+            <w:tcW w:type="dxa" w:w="7540"/>
+          </w:tcPr>
+          <w:p>
+            <w:pPr>
+              <w:spacing w:before="120"/>
+            </w:pPr>
+            <w:r>
+              <w:rPr>
+                <w:b/>
+                <w:color w:val="C97C00"/>
+                <w:sz w:val="52"/>
+              </w:rPr>
+              <w:t>3</w:t>
+            </w:r>
+          </w:p>
+          <w:p>
+            <w:pPr>
+              <w:spacing w:before="40" w:after="0"/>
+            </w:pPr>
+            <w:r>
+              <w:drawing>
+                <wp:inline xmlns:a="http://schemas.openxmlformats.org/drawingml/2006/main" xmlns:pic="http://schemas.openxmlformats.org/drawingml/2006/picture">
+                  <wp:extent cx="3103438" cy="2052000"/>
+                  <wp:docPr id="17" name="Picture 17"/>
+                  <wp:cNvGraphicFramePr>
+                    <a:graphicFrameLocks noChangeAspect="1"/>
+                  </wp:cNvGraphicFramePr>
+                  <a:graphic>
+                    <a:graphicData uri="http://schemas.openxmlformats.org/drawingml/2006/picture">
+                      <pic:pic>
+                        <pic:nvPicPr>
+                          <pic:cNvPr id="0" name="b03.png"/>
+                          <pic:cNvPicPr/>
+                        </pic:nvPicPr>
+                        <pic:blipFill>
+                          <a:blip r:embed="rId25"/>
+                          <a:stretch>
+                            <a:fillRect/>
+                          </a:stretch>
+                        </pic:blipFill>
+                        <pic:spPr>
+                          <a:xfrm>
+                            <a:off x="0" y="0"/>
+                            <a:ext cx="3103438" cy="2052000"/>
+                          </a:xfrm>
+                          <a:prstGeom prst="rect"/>
+                        </pic:spPr>
+                      </pic:pic>
+                    </a:graphicData>
+                  </a:graphic>
+                </wp:inline>
+              </w:drawing>
+            </w:r>
+          </w:p>
+        </w:tc>
+        <w:tc>
+          <w:tcPr>
+            <w:tcW w:type="dxa" w:w="7540"/>
+          </w:tcPr>
+          <w:p>
+            <w:pPr>
+              <w:spacing w:before="120"/>
+            </w:pPr>
+            <w:r>
+              <w:rPr>
+                <w:b/>
+                <w:color w:val="C97C00"/>
+                <w:sz w:val="52"/>
+              </w:rPr>
+              <w:t>4</w:t>
+            </w:r>
+          </w:p>
+          <w:p>
+            <w:pPr>
+              <w:spacing w:before="40" w:after="0"/>
+            </w:pPr>
+            <w:r>
+              <w:drawing>
+                <wp:inline xmlns:a="http://schemas.openxmlformats.org/drawingml/2006/main" xmlns:pic="http://schemas.openxmlformats.org/drawingml/2006/picture">
+                  <wp:extent cx="3103438" cy="2052000"/>
+                  <wp:docPr id="18" name="Picture 18"/>
+                  <wp:cNvGraphicFramePr>
+                    <a:graphicFrameLocks noChangeAspect="1"/>
+                  </wp:cNvGraphicFramePr>
+                  <a:graphic>
+                    <a:graphicData uri="http://schemas.openxmlformats.org/drawingml/2006/picture">
+                      <pic:pic>
+                        <pic:nvPicPr>
+                          <pic:cNvPr id="0" name="b04.png"/>
+                          <pic:cNvPicPr/>
+                        </pic:nvPicPr>
+                        <pic:blipFill>
+                          <a:blip r:embed="rId26"/>
+                          <a:stretch>
+                            <a:fillRect/>
+                          </a:stretch>
+                        </pic:blipFill>
+                        <pic:spPr>
+                          <a:xfrm>
+                            <a:off x="0" y="0"/>
+                            <a:ext cx="3103438" cy="2052000"/>
+                          </a:xfrm>
+                          <a:prstGeom prst="rect"/>
+                        </pic:spPr>
+                      </pic:pic>
+                    </a:graphicData>
+                  </a:graphic>
+                </wp:inline>
+              </w:drawing>
+            </w:r>
+          </w:p>
+        </w:tc>
+      </w:tr>
+    </w:tbl>
+    <w:p>
+      <w:pPr>
+        <w:spacing w:before="120" w:after="0"/>
+      </w:pPr>
+      <w:r>
+        <w:rPr>
+          <w:b w:val="0"/>
+          <w:i/>
+          <w:color w:val="0F1B33"/>
+          <w:sz w:val="28"/>
+        </w:rPr>
+        <w:t>Bass key:  lines G B D F A  |  spaces A C E G</w:t>
+      </w:r>
+    </w:p>
+    <w:p>
+      <w:pPr>
+        <w:rPr>
+          <w:sz w:val="2"/>
+        </w:rPr>
+      </w:pPr>
+      <w:r>
+        <w:rPr>
+          <w:sz w:val="2"/>
+        </w:rPr>
+        <w:br w:type="page"/>
+      </w:r>
+    </w:p>
+    <w:tbl>
+      <w:tblPr>
+        <w:tblW w:type="auto" w:w="0"/>
+        <w:tblLayout w:type="fixed"/>
+        <w:tblLook w:firstColumn="1" w:firstRow="1" w:lastColumn="0" w:lastRow="0" w:noHBand="0" w:noVBand="1" w:val="04A0"/>
+        <w:tblLayout w:type="fixed"/>
+      </w:tblPr>
+      <w:tblGrid>
+        <w:gridCol w:w="10318"/>
+        <w:gridCol w:w="4819"/>
+      </w:tblGrid>
+      <w:tr>
+        <w:tc>
+          <w:tcPr>
+            <w:tcW w:type="dxa" w:w="10318"/>
+          </w:tcPr>
+          <w:p>
+            <w:r>
+              <w:rPr>
+                <w:b/>
+                <w:sz w:val="68"/>
+              </w:rPr>
+              <w:t>Bass clef: codes 5 to 8</w:t>
+            </w:r>
+          </w:p>
+          <w:p>
+            <w:r>
+              <w:rPr>
+                <w:b/>
+                <w:color w:val="C97C00"/>
+                <w:sz w:val="36"/>
+              </w:rPr>
+              <w:t>Use the bass key. Remember the notes move!</w:t>
+            </w:r>
+          </w:p>
+        </w:tc>
+        <w:tc>
+          <w:tcPr>
+            <w:tcW w:type="dxa" w:w="4819"/>
+          </w:tcPr>
+          <w:p>
+            <w:pPr>
+              <w:spacing w:before="200"/>
+              <w:jc w:val="right"/>
+            </w:pPr>
+            <w:r>
+              <w:rPr>
+                <w:sz w:val="40"/>
+              </w:rPr>
+              <w:t>Name: ______________</w:t>
+            </w:r>
+          </w:p>
+        </w:tc>
+      </w:tr>
+    </w:tbl>
+    <w:p>
+      <w:pPr>
+        <w:spacing w:before="0" w:after="0"/>
+      </w:pPr>
+      <w:r>
+        <w:rPr>
+          <w:b w:val="0"/>
+          <w:i w:val="0"/>
+          <w:color w:val="0F1B33"/>
+          <w:sz w:val="12"/>
+        </w:rPr>
+      </w:r>
+    </w:p>
+    <w:tbl>
+      <w:tblPr>
+        <w:tblW w:type="auto" w:w="0"/>
+        <w:tblLayout w:type="fixed"/>
+        <w:tblLook w:firstColumn="1" w:firstRow="1" w:lastColumn="0" w:lastRow="0" w:noHBand="0" w:noVBand="1" w:val="04A0"/>
+        <w:tblLayout w:type="fixed"/>
+      </w:tblPr>
+      <w:tblGrid>
+        <w:gridCol w:w="7540"/>
+        <w:gridCol w:w="7540"/>
+      </w:tblGrid>
+      <w:tr>
+        <w:tc>
+          <w:tcPr>
+            <w:tcW w:type="dxa" w:w="7540"/>
+          </w:tcPr>
+          <w:p>
+            <w:pPr>
+              <w:spacing w:before="120"/>
+            </w:pPr>
+            <w:r>
+              <w:rPr>
+                <w:b/>
+                <w:color w:val="C97C00"/>
+                <w:sz w:val="52"/>
+              </w:rPr>
+              <w:t>5</w:t>
+            </w:r>
+          </w:p>
+          <w:p>
+            <w:pPr>
+              <w:spacing w:before="40" w:after="0"/>
+            </w:pPr>
+            <w:r>
+              <w:drawing>
+                <wp:inline xmlns:a="http://schemas.openxmlformats.org/drawingml/2006/main" xmlns:pic="http://schemas.openxmlformats.org/drawingml/2006/picture">
+                  <wp:extent cx="3815702" cy="2052000"/>
+                  <wp:docPr id="19" name="Picture 19"/>
+                  <wp:cNvGraphicFramePr>
+                    <a:graphicFrameLocks noChangeAspect="1"/>
+                  </wp:cNvGraphicFramePr>
+                  <a:graphic>
+                    <a:graphicData uri="http://schemas.openxmlformats.org/drawingml/2006/picture">
+                      <pic:pic>
+                        <pic:nvPicPr>
+                          <pic:cNvPr id="0" name="b05.png"/>
+                          <pic:cNvPicPr/>
+                        </pic:nvPicPr>
+                        <pic:blipFill>
+                          <a:blip r:embed="rId27"/>
+                          <a:stretch>
+                            <a:fillRect/>
+                          </a:stretch>
+                        </pic:blipFill>
+                        <pic:spPr>
+                          <a:xfrm>
+                            <a:off x="0" y="0"/>
+                            <a:ext cx="3815702" cy="2052000"/>
+                          </a:xfrm>
+                          <a:prstGeom prst="rect"/>
+                        </pic:spPr>
+                      </pic:pic>
+                    </a:graphicData>
+                  </a:graphic>
+                </wp:inline>
+              </w:drawing>
+            </w:r>
+          </w:p>
+        </w:tc>
+        <w:tc>
+          <w:tcPr>
+            <w:tcW w:type="dxa" w:w="7540"/>
+          </w:tcPr>
+          <w:p>
+            <w:pPr>
+              <w:spacing w:before="120"/>
+            </w:pPr>
+            <w:r>
+              <w:rPr>
+                <w:b/>
+                <w:color w:val="C97C00"/>
+                <w:sz w:val="52"/>
+              </w:rPr>
+              <w:t>6</w:t>
+            </w:r>
+          </w:p>
+          <w:p>
+            <w:pPr>
+              <w:spacing w:before="40" w:after="0"/>
+            </w:pPr>
+            <w:r>
+              <w:drawing>
+                <wp:inline xmlns:a="http://schemas.openxmlformats.org/drawingml/2006/main" xmlns:pic="http://schemas.openxmlformats.org/drawingml/2006/picture">
+                  <wp:extent cx="3614090" cy="2052000"/>
+                  <wp:docPr id="20" name="Picture 20"/>
+                  <wp:cNvGraphicFramePr>
+                    <a:graphicFrameLocks noChangeAspect="1"/>
+                  </wp:cNvGraphicFramePr>
+                  <a:graphic>
+                    <a:graphicData uri="http://schemas.openxmlformats.org/drawingml/2006/picture">
+                      <pic:pic>
+                        <pic:nvPicPr>
+                          <pic:cNvPr id="0" name="b06.png"/>
+                          <pic:cNvPicPr/>
+                        </pic:nvPicPr>
+                        <pic:blipFill>
+                          <a:blip r:embed="rId28"/>
+                          <a:stretch>
+                            <a:fillRect/>
+                          </a:stretch>
+                        </pic:blipFill>
+                        <pic:spPr>
+                          <a:xfrm>
+                            <a:off x="0" y="0"/>
+                            <a:ext cx="3614090" cy="2052000"/>
+                          </a:xfrm>
+                          <a:prstGeom prst="rect"/>
+                        </pic:spPr>
+                      </pic:pic>
+                    </a:graphicData>
+                  </a:graphic>
+                </wp:inline>
+              </w:drawing>
+            </w:r>
+          </w:p>
+        </w:tc>
+      </w:tr>
+      <w:tr>
+        <w:tc>
+          <w:tcPr>
+            <w:tcW w:type="dxa" w:w="7540"/>
+          </w:tcPr>
+          <w:p>
+            <w:pPr>
+              <w:spacing w:before="120"/>
+            </w:pPr>
+            <w:r>
+              <w:rPr>
+                <w:b/>
+                <w:color w:val="C97C00"/>
+                <w:sz w:val="52"/>
+              </w:rPr>
+              <w:t>7</w:t>
+            </w:r>
+          </w:p>
+          <w:p>
+            <w:pPr>
+              <w:spacing w:before="40" w:after="0"/>
+            </w:pPr>
+            <w:r>
+              <w:drawing>
+                <wp:inline xmlns:a="http://schemas.openxmlformats.org/drawingml/2006/main" xmlns:pic="http://schemas.openxmlformats.org/drawingml/2006/picture">
+                  <wp:extent cx="3815702" cy="2052000"/>
+                  <wp:docPr id="21" name="Picture 21"/>
+                  <wp:cNvGraphicFramePr>
+                    <a:graphicFrameLocks noChangeAspect="1"/>
+                  </wp:cNvGraphicFramePr>
+                  <a:graphic>
+                    <a:graphicData uri="http://schemas.openxmlformats.org/drawingml/2006/picture">
+                      <pic:pic>
+                        <pic:nvPicPr>
+                          <pic:cNvPr id="0" name="b07.png"/>
+                          <pic:cNvPicPr/>
+                        </pic:nvPicPr>
+                        <pic:blipFill>
+                          <a:blip r:embed="rId29"/>
+                          <a:stretch>
+                            <a:fillRect/>
+                          </a:stretch>
+                        </pic:blipFill>
+                        <pic:spPr>
+                          <a:xfrm>
+                            <a:off x="0" y="0"/>
+                            <a:ext cx="3815702" cy="2052000"/>
+                          </a:xfrm>
+                          <a:prstGeom prst="rect"/>
+                        </pic:spPr>
+                      </pic:pic>
+                    </a:graphicData>
+                  </a:graphic>
+                </wp:inline>
+              </w:drawing>
+            </w:r>
+          </w:p>
+        </w:tc>
+        <w:tc>
+          <w:tcPr>
+            <w:tcW w:type="dxa" w:w="7540"/>
+          </w:tcPr>
+          <w:p>
+            <w:pPr>
+              <w:spacing w:before="120"/>
+            </w:pPr>
+            <w:r>
+              <w:rPr>
+                <w:b/>
+                <w:color w:val="C97C00"/>
+                <w:sz w:val="52"/>
+              </w:rPr>
+              <w:t>8</w:t>
+            </w:r>
+          </w:p>
+          <w:p>
+            <w:pPr>
+              <w:spacing w:before="40" w:after="0"/>
+            </w:pPr>
+            <w:r>
+              <w:drawing>
+                <wp:inline xmlns:a="http://schemas.openxmlformats.org/drawingml/2006/main" xmlns:pic="http://schemas.openxmlformats.org/drawingml/2006/picture">
+                  <wp:extent cx="3614090" cy="2052000"/>
+                  <wp:docPr id="22" name="Picture 22"/>
+                  <wp:cNvGraphicFramePr>
+                    <a:graphicFrameLocks noChangeAspect="1"/>
+                  </wp:cNvGraphicFramePr>
+                  <a:graphic>
+                    <a:graphicData uri="http://schemas.openxmlformats.org/drawingml/2006/picture">
+                      <pic:pic>
+                        <pic:nvPicPr>
+                          <pic:cNvPr id="0" name="b08.png"/>
+                          <pic:cNvPicPr/>
+                        </pic:nvPicPr>
+                        <pic:blipFill>
+                          <a:blip r:embed="rId30"/>
+                          <a:stretch>
+                            <a:fillRect/>
+                          </a:stretch>
+                        </pic:blipFill>
+                        <pic:spPr>
+                          <a:xfrm>
+                            <a:off x="0" y="0"/>
+                            <a:ext cx="3614090" cy="2052000"/>
+                          </a:xfrm>
+                          <a:prstGeom prst="rect"/>
+                        </pic:spPr>
+                      </pic:pic>
+                    </a:graphicData>
+                  </a:graphic>
+                </wp:inline>
+              </w:drawing>
+            </w:r>
+          </w:p>
+        </w:tc>
+      </w:tr>
+    </w:tbl>
+    <w:p>
+      <w:pPr>
+        <w:spacing w:before="120" w:after="0"/>
+      </w:pPr>
+      <w:r>
+        <w:rPr>
+          <w:b w:val="0"/>
+          <w:i/>
+          <w:color w:val="0F1B33"/>
+          <w:sz w:val="28"/>
+        </w:rPr>
+        <w:t>Bass key:  lines G B D F A  |  spaces A C E G</w:t>
+      </w:r>
+    </w:p>
+    <w:p>
+      <w:pPr>
+        <w:rPr>
+          <w:sz w:val="2"/>
+        </w:rPr>
+      </w:pPr>
+      <w:r>
+        <w:rPr>
+          <w:sz w:val="2"/>
+        </w:rPr>
+        <w:br w:type="page"/>
+      </w:r>
+    </w:p>
+    <w:tbl>
+      <w:tblPr>
+        <w:tblW w:type="auto" w:w="0"/>
+        <w:tblLayout w:type="fixed"/>
+        <w:tblLook w:firstColumn="1" w:firstRow="1" w:lastColumn="0" w:lastRow="0" w:noHBand="0" w:noVBand="1" w:val="04A0"/>
+        <w:tblLayout w:type="fixed"/>
+      </w:tblPr>
+      <w:tblGrid>
+        <w:gridCol w:w="10318"/>
+        <w:gridCol w:w="4819"/>
+      </w:tblGrid>
+      <w:tr>
+        <w:tc>
+          <w:tcPr>
+            <w:tcW w:type="dxa" w:w="10318"/>
+          </w:tcPr>
+          <w:p>
+            <w:r>
+              <w:rPr>
+                <w:b/>
+                <w:sz w:val="68"/>
+              </w:rPr>
+              <w:t>Bass clef: codes 9 to 12</w:t>
+            </w:r>
+          </w:p>
+          <w:p>
+            <w:r>
+              <w:rPr>
+                <w:b/>
+                <w:color w:val="C97C00"/>
+                <w:sz w:val="36"/>
+              </w:rPr>
+              <w:t>Use the bass key. Remember the notes move!</w:t>
+            </w:r>
+          </w:p>
+        </w:tc>
+        <w:tc>
+          <w:tcPr>
+            <w:tcW w:type="dxa" w:w="4819"/>
+          </w:tcPr>
+          <w:p>
+            <w:pPr>
+              <w:spacing w:before="200"/>
+              <w:jc w:val="right"/>
+            </w:pPr>
+            <w:r>
+              <w:rPr>
+                <w:sz w:val="40"/>
+              </w:rPr>
+              <w:t>Name: ______________</w:t>
+            </w:r>
+          </w:p>
+        </w:tc>
+      </w:tr>
+    </w:tbl>
+    <w:p>
+      <w:pPr>
+        <w:spacing w:before="0" w:after="0"/>
+      </w:pPr>
+      <w:r>
+        <w:rPr>
+          <w:b w:val="0"/>
+          <w:i w:val="0"/>
+          <w:color w:val="0F1B33"/>
+          <w:sz w:val="12"/>
+        </w:rPr>
+      </w:r>
+    </w:p>
+    <w:tbl>
+      <w:tblPr>
+        <w:tblW w:type="auto" w:w="0"/>
+        <w:tblLayout w:type="fixed"/>
+        <w:tblLook w:firstColumn="1" w:firstRow="1" w:lastColumn="0" w:lastRow="0" w:noHBand="0" w:noVBand="1" w:val="04A0"/>
+        <w:tblLayout w:type="fixed"/>
+      </w:tblPr>
+      <w:tblGrid>
+        <w:gridCol w:w="7540"/>
+        <w:gridCol w:w="7540"/>
+      </w:tblGrid>
+      <w:tr>
+        <w:tc>
+          <w:tcPr>
+            <w:tcW w:type="dxa" w:w="7540"/>
+          </w:tcPr>
+          <w:p>
+            <w:pPr>
+              <w:spacing w:before="120"/>
+            </w:pPr>
+            <w:r>
+              <w:rPr>
+                <w:b/>
+                <w:color w:val="C97C00"/>
+                <w:sz w:val="52"/>
+              </w:rPr>
+              <w:t>9</w:t>
+            </w:r>
+          </w:p>
+          <w:p>
+            <w:pPr>
+              <w:spacing w:before="40" w:after="0"/>
+            </w:pPr>
+            <w:r>
+              <w:drawing>
+                <wp:inline xmlns:a="http://schemas.openxmlformats.org/drawingml/2006/main" xmlns:pic="http://schemas.openxmlformats.org/drawingml/2006/picture">
+                  <wp:extent cx="4392000" cy="1990382"/>
+                  <wp:docPr id="23" name="Picture 23"/>
+                  <wp:cNvGraphicFramePr>
+                    <a:graphicFrameLocks noChangeAspect="1"/>
+                  </wp:cNvGraphicFramePr>
+                  <a:graphic>
+                    <a:graphicData uri="http://schemas.openxmlformats.org/drawingml/2006/picture">
+                      <pic:pic>
+                        <pic:nvPicPr>
+                          <pic:cNvPr id="0" name="b09.png"/>
+                          <pic:cNvPicPr/>
+                        </pic:nvPicPr>
+                        <pic:blipFill>
+                          <a:blip r:embed="rId31"/>
+                          <a:stretch>
+                            <a:fillRect/>
+                          </a:stretch>
+                        </pic:blipFill>
+                        <pic:spPr>
+                          <a:xfrm>
+                            <a:off x="0" y="0"/>
+                            <a:ext cx="4392000" cy="1990382"/>
+                          </a:xfrm>
+                          <a:prstGeom prst="rect"/>
+                        </pic:spPr>
+                      </pic:pic>
+                    </a:graphicData>
+                  </a:graphic>
+                </wp:inline>
+              </w:drawing>
+            </w:r>
+          </w:p>
+        </w:tc>
+        <w:tc>
+          <w:tcPr>
+            <w:tcW w:type="dxa" w:w="7540"/>
+          </w:tcPr>
+          <w:p>
+            <w:pPr>
+              <w:spacing w:before="120"/>
+            </w:pPr>
+            <w:r>
+              <w:rPr>
+                <w:b/>
+                <w:color w:val="C97C00"/>
+                <w:sz w:val="52"/>
+              </w:rPr>
+              <w:t>10</w:t>
+            </w:r>
+          </w:p>
+          <w:p>
+            <w:pPr>
+              <w:spacing w:before="40" w:after="0"/>
+            </w:pPr>
+            <w:r>
+              <w:drawing>
+                <wp:inline xmlns:a="http://schemas.openxmlformats.org/drawingml/2006/main" xmlns:pic="http://schemas.openxmlformats.org/drawingml/2006/picture">
+                  <wp:extent cx="4288720" cy="2052000"/>
+                  <wp:docPr id="24" name="Picture 24"/>
+                  <wp:cNvGraphicFramePr>
+                    <a:graphicFrameLocks noChangeAspect="1"/>
+                  </wp:cNvGraphicFramePr>
+                  <a:graphic>
+                    <a:graphicData uri="http://schemas.openxmlformats.org/drawingml/2006/picture">
+                      <pic:pic>
+                        <pic:nvPicPr>
+                          <pic:cNvPr id="0" name="b10.png"/>
+                          <pic:cNvPicPr/>
+                        </pic:nvPicPr>
+                        <pic:blipFill>
+                          <a:blip r:embed="rId32"/>
+                          <a:stretch>
+                            <a:fillRect/>
+                          </a:stretch>
+                        </pic:blipFill>
+                        <pic:spPr>
+                          <a:xfrm>
+                            <a:off x="0" y="0"/>
+                            <a:ext cx="4288720" cy="2052000"/>
+                          </a:xfrm>
+                          <a:prstGeom prst="rect"/>
+                        </pic:spPr>
+                      </pic:pic>
+                    </a:graphicData>
+                  </a:graphic>
+                </wp:inline>
+              </w:drawing>
+            </w:r>
+          </w:p>
+        </w:tc>
+      </w:tr>
+      <w:tr>
+        <w:tc>
+          <w:tcPr>
+            <w:tcW w:type="dxa" w:w="7540"/>
+          </w:tcPr>
+          <w:p>
+            <w:pPr>
+              <w:spacing w:before="120"/>
+            </w:pPr>
+            <w:r>
+              <w:rPr>
+                <w:b/>
+                <w:color w:val="C97C00"/>
+                <w:sz w:val="52"/>
+              </w:rPr>
+              <w:t>11</w:t>
+            </w:r>
+          </w:p>
+          <w:p>
+            <w:pPr>
+              <w:spacing w:before="40" w:after="0"/>
+            </w:pPr>
+            <w:r>
+              <w:drawing>
+                <wp:inline xmlns:a="http://schemas.openxmlformats.org/drawingml/2006/main" xmlns:pic="http://schemas.openxmlformats.org/drawingml/2006/picture">
+                  <wp:extent cx="4392000" cy="1719845"/>
+                  <wp:docPr id="25" name="Picture 25"/>
+                  <wp:cNvGraphicFramePr>
+                    <a:graphicFrameLocks noChangeAspect="1"/>
+                  </wp:cNvGraphicFramePr>
+                  <a:graphic>
+                    <a:graphicData uri="http://schemas.openxmlformats.org/drawingml/2006/picture">
+                      <pic:pic>
+                        <pic:nvPicPr>
+                          <pic:cNvPr id="0" name="b11.png"/>
+                          <pic:cNvPicPr/>
+                        </pic:nvPicPr>
+                        <pic:blipFill>
+                          <a:blip r:embed="rId33"/>
+                          <a:stretch>
+                            <a:fillRect/>
+                          </a:stretch>
+                        </pic:blipFill>
+                        <pic:spPr>
+                          <a:xfrm>
+                            <a:off x="0" y="0"/>
+                            <a:ext cx="4392000" cy="1719845"/>
+                          </a:xfrm>
+                          <a:prstGeom prst="rect"/>
+                        </pic:spPr>
+                      </pic:pic>
+                    </a:graphicData>
+                  </a:graphic>
+                </wp:inline>
+              </w:drawing>
+            </w:r>
+          </w:p>
+        </w:tc>
+        <w:tc>
+          <w:tcPr>
+            <w:tcW w:type="dxa" w:w="7540"/>
+          </w:tcPr>
+          <w:p>
+            <w:pPr>
+              <w:spacing w:before="120"/>
+            </w:pPr>
+            <w:r>
+              <w:rPr>
+                <w:b/>
+                <w:color w:val="C97C00"/>
+                <w:sz w:val="52"/>
+              </w:rPr>
+              <w:t>12</w:t>
+            </w:r>
+          </w:p>
+          <w:p>
+            <w:pPr>
+              <w:spacing w:before="40" w:after="0"/>
+            </w:pPr>
+            <w:r>
+              <w:drawing>
+                <wp:inline xmlns:a="http://schemas.openxmlformats.org/drawingml/2006/main" xmlns:pic="http://schemas.openxmlformats.org/drawingml/2006/picture">
+                  <wp:extent cx="4392000" cy="1815786"/>
+                  <wp:docPr id="26" name="Picture 26"/>
+                  <wp:cNvGraphicFramePr>
+                    <a:graphicFrameLocks noChangeAspect="1"/>
+                  </wp:cNvGraphicFramePr>
+                  <a:graphic>
+                    <a:graphicData uri="http://schemas.openxmlformats.org/drawingml/2006/picture">
+                      <pic:pic>
+                        <pic:nvPicPr>
+                          <pic:cNvPr id="0" name="b12.png"/>
+                          <pic:cNvPicPr/>
+                        </pic:nvPicPr>
+                        <pic:blipFill>
+                          <a:blip r:embed="rId34"/>
+                          <a:stretch>
+                            <a:fillRect/>
+                          </a:stretch>
+                        </pic:blipFill>
+                        <pic:spPr>
+                          <a:xfrm>
+                            <a:off x="0" y="0"/>
+                            <a:ext cx="4392000" cy="1815786"/>
+                          </a:xfrm>
+                          <a:prstGeom prst="rect"/>
+                        </pic:spPr>
+                      </pic:pic>
+                    </a:graphicData>
+                  </a:graphic>
+                </wp:inline>
+              </w:drawing>
+            </w:r>
+          </w:p>
+        </w:tc>
+      </w:tr>
+    </w:tbl>
+    <w:p>
+      <w:pPr>
+        <w:spacing w:before="120" w:after="0"/>
+      </w:pPr>
+      <w:r>
+        <w:rPr>
+          <w:b w:val="0"/>
+          <w:i/>
+          <w:color w:val="0F1B33"/>
+          <w:sz w:val="28"/>
+        </w:rPr>
+        <w:t>Bass key:  lines G B D F A  |  spaces A C E G</w:t>
+      </w:r>
+    </w:p>
+    <w:p>
+      <w:pPr>
+        <w:rPr>
+          <w:sz w:val="2"/>
+        </w:rPr>
+      </w:pPr>
+      <w:r>
+        <w:rPr>
+          <w:sz w:val="2"/>
+        </w:rPr>
+        <w:br w:type="page"/>
+      </w:r>
+    </w:p>
+    <w:tbl>
+      <w:tblPr>
+        <w:tblW w:type="auto" w:w="0"/>
+        <w:tblLayout w:type="fixed"/>
+        <w:tblLook w:firstColumn="1" w:firstRow="1" w:lastColumn="0" w:lastRow="0" w:noHBand="0" w:noVBand="1" w:val="04A0"/>
+        <w:tblLayout w:type="fixed"/>
+      </w:tblPr>
+      <w:tblGrid>
+        <w:gridCol w:w="10318"/>
+        <w:gridCol w:w="4819"/>
+      </w:tblGrid>
+      <w:tr>
+        <w:tc>
+          <w:tcPr>
+            <w:tcW w:type="dxa" w:w="10318"/>
+          </w:tcPr>
+          <w:p>
+            <w:r>
+              <w:rPr>
+                <w:b/>
+                <w:sz w:val="68"/>
+              </w:rPr>
+              <w:t>Mixed clefs: codes 1 and 2</w:t>
+            </w:r>
+          </w:p>
+          <w:p>
+            <w:r>
+              <w:rPr>
+                <w:b/>
+                <w:color w:val="C97C00"/>
+                <w:sz w:val="36"/>
+              </w:rPr>
+              <w:t>The clef changes halfway. Check each one!</w:t>
+            </w:r>
+          </w:p>
+        </w:tc>
+        <w:tc>
+          <w:tcPr>
+            <w:tcW w:type="dxa" w:w="4819"/>
+          </w:tcPr>
+          <w:p>
+            <w:pPr>
+              <w:spacing w:before="200"/>
+              <w:jc w:val="right"/>
+            </w:pPr>
+            <w:r>
+              <w:rPr>
+                <w:sz w:val="40"/>
+              </w:rPr>
+              <w:t>Name: ______________</w:t>
+            </w:r>
+          </w:p>
+        </w:tc>
+      </w:tr>
+    </w:tbl>
+    <w:p>
+      <w:pPr>
+        <w:spacing w:before="0" w:after="0"/>
+      </w:pPr>
+      <w:r>
+        <w:rPr>
+          <w:b w:val="0"/>
+          <w:i w:val="0"/>
+          <w:color w:val="0F1B33"/>
+          <w:sz w:val="8"/>
+        </w:rPr>
+      </w:r>
+    </w:p>
+    <w:tbl>
+      <w:tblPr>
+        <w:tblW w:type="auto" w:w="0"/>
+        <w:tblLayout w:type="fixed"/>
+        <w:tblLook w:firstColumn="1" w:firstRow="1" w:lastColumn="0" w:lastRow="0" w:noHBand="0" w:noVBand="1" w:val="04A0"/>
+        <w:tblLayout w:type="fixed"/>
+      </w:tblPr>
+      <w:tblGrid>
+        <w:gridCol w:w="1134"/>
+        <w:gridCol w:w="14003"/>
+      </w:tblGrid>
+      <w:tr>
+        <w:tc>
+          <w:tcPr>
+            <w:tcW w:type="dxa" w:w="1134"/>
+          </w:tcPr>
+          <w:p>
+            <w:pPr>
+              <w:spacing w:before="120"/>
+            </w:pPr>
+            <w:r>
+              <w:rPr>
+                <w:b/>
+                <w:color w:val="C97C00"/>
+                <w:sz w:val="52"/>
+              </w:rPr>
+              <w:t>1</w:t>
+            </w:r>
+          </w:p>
+        </w:tc>
+        <w:tc>
+          <w:tcPr>
+            <w:tcW w:type="dxa" w:w="14003"/>
+          </w:tcPr>
+          <w:p>
+            <w:pPr>
+              <w:spacing w:before="40" w:after="0"/>
+            </w:pPr>
+            <w:r>
+              <w:drawing>
+                <wp:inline xmlns:a="http://schemas.openxmlformats.org/drawingml/2006/main" xmlns:pic="http://schemas.openxmlformats.org/drawingml/2006/picture">
+                  <wp:extent cx="5867354" cy="2304000"/>
+                  <wp:docPr id="27" name="Picture 27"/>
+                  <wp:cNvGraphicFramePr>
+                    <a:graphicFrameLocks noChangeAspect="1"/>
+                  </wp:cNvGraphicFramePr>
+                  <a:graphic>
+                    <a:graphicData uri="http://schemas.openxmlformats.org/drawingml/2006/picture">
+                      <pic:pic>
+                        <pic:nvPicPr>
+                          <pic:cNvPr id="0" name="m01.png"/>
+                          <pic:cNvPicPr/>
+                        </pic:nvPicPr>
+                        <pic:blipFill>
+                          <a:blip r:embed="rId35"/>
+                          <a:stretch>
+                            <a:fillRect/>
+                          </a:stretch>
+                        </pic:blipFill>
+                        <pic:spPr>
+                          <a:xfrm>
+                            <a:off x="0" y="0"/>
+                            <a:ext cx="5867354" cy="2304000"/>
+                          </a:xfrm>
+                          <a:prstGeom prst="rect"/>
+                        </pic:spPr>
+                      </pic:pic>
+                    </a:graphicData>
+                  </a:graphic>
+                </wp:inline>
+              </w:drawing>
+            </w:r>
+          </w:p>
+        </w:tc>
+      </w:tr>
+      <w:tr>
+        <w:tc>
+          <w:tcPr>
+            <w:tcW w:type="dxa" w:w="1134"/>
+          </w:tcPr>
+          <w:p>
+            <w:pPr>
+              <w:spacing w:before="120"/>
+            </w:pPr>
+            <w:r>
+              <w:rPr>
+                <w:b/>
+                <w:color w:val="C97C00"/>
+                <w:sz w:val="52"/>
+              </w:rPr>
+              <w:t>2</w:t>
+            </w:r>
+          </w:p>
+        </w:tc>
+        <w:tc>
+          <w:tcPr>
+            <w:tcW w:type="dxa" w:w="14003"/>
+          </w:tcPr>
+          <w:p>
+            <w:pPr>
+              <w:spacing w:before="40" w:after="0"/>
+            </w:pPr>
+            <w:r>
+              <w:drawing>
+                <wp:inline xmlns:a="http://schemas.openxmlformats.org/drawingml/2006/main" xmlns:pic="http://schemas.openxmlformats.org/drawingml/2006/picture">
+                  <wp:extent cx="7254709" cy="2304000"/>
+                  <wp:docPr id="28" name="Picture 28"/>
+                  <wp:cNvGraphicFramePr>
+                    <a:graphicFrameLocks noChangeAspect="1"/>
+                  </wp:cNvGraphicFramePr>
+                  <a:graphic>
+                    <a:graphicData uri="http://schemas.openxmlformats.org/drawingml/2006/picture">
+                      <pic:pic>
+                        <pic:nvPicPr>
+                          <pic:cNvPr id="0" name="m02.png"/>
+                          <pic:cNvPicPr/>
+                        </pic:nvPicPr>
+                        <pic:blipFill>
+                          <a:blip r:embed="rId36"/>
+                          <a:stretch>
+                            <a:fillRect/>
+                          </a:stretch>
+                        </pic:blipFill>
+                        <pic:spPr>
+                          <a:xfrm>
+                            <a:off x="0" y="0"/>
+                            <a:ext cx="7254709" cy="2304000"/>
+                          </a:xfrm>
+                          <a:prstGeom prst="rect"/>
+                        </pic:spPr>
+                      </pic:pic>
+                    </a:graphicData>
+                  </a:graphic>
+                </wp:inline>
+              </w:drawing>
+            </w:r>
+          </w:p>
+        </w:tc>
+      </w:tr>
+    </w:tbl>
+    <w:p>
+      <w:pPr>
+        <w:spacing w:before="120" w:after="0"/>
+      </w:pPr>
+      <w:r>
+        <w:rPr>
+          <w:b w:val="0"/>
+          <w:i/>
+          <w:color w:val="0F1B33"/>
+          <w:sz w:val="28"/>
+        </w:rPr>
+        <w:t>Treble key:  lines E G B D F  |  spaces F A C E     Bass key:  lines G B D F A  |  spaces A C E G</w:t>
+      </w:r>
+    </w:p>
+    <w:p>
+      <w:pPr>
+        <w:rPr>
+          <w:sz w:val="2"/>
+        </w:rPr>
+      </w:pPr>
+      <w:r>
+        <w:rPr>
+          <w:sz w:val="2"/>
+        </w:rPr>
+        <w:br w:type="page"/>
+      </w:r>
+    </w:p>
+    <w:tbl>
+      <w:tblPr>
+        <w:tblW w:type="auto" w:w="0"/>
+        <w:tblLayout w:type="fixed"/>
+        <w:tblLook w:firstColumn="1" w:firstRow="1" w:lastColumn="0" w:lastRow="0" w:noHBand="0" w:noVBand="1" w:val="04A0"/>
+        <w:tblLayout w:type="fixed"/>
+      </w:tblPr>
+      <w:tblGrid>
+        <w:gridCol w:w="10318"/>
+        <w:gridCol w:w="4819"/>
+      </w:tblGrid>
+      <w:tr>
+        <w:tc>
+          <w:tcPr>
+            <w:tcW w:type="dxa" w:w="10318"/>
+          </w:tcPr>
+          <w:p>
+            <w:r>
+              <w:rPr>
+                <w:b/>
+                <w:sz w:val="68"/>
+              </w:rPr>
+              <w:t>Mixed clefs: codes 3 and 4</w:t>
+            </w:r>
+          </w:p>
+          <w:p>
+            <w:r>
+              <w:rPr>
+                <w:b/>
+                <w:color w:val="C97C00"/>
+                <w:sz w:val="36"/>
+              </w:rPr>
+              <w:t>The clef changes halfway. Check each one!</w:t>
+            </w:r>
+          </w:p>
+        </w:tc>
+        <w:tc>
+          <w:tcPr>
+            <w:tcW w:type="dxa" w:w="4819"/>
+          </w:tcPr>
+          <w:p>
+            <w:pPr>
+              <w:spacing w:before="200"/>
+              <w:jc w:val="right"/>
+            </w:pPr>
+            <w:r>
+              <w:rPr>
+                <w:sz w:val="40"/>
+              </w:rPr>
+              <w:t>Name: ______________</w:t>
+            </w:r>
+          </w:p>
+        </w:tc>
+      </w:tr>
+    </w:tbl>
+    <w:p>
+      <w:pPr>
+        <w:spacing w:before="0" w:after="0"/>
+      </w:pPr>
+      <w:r>
+        <w:rPr>
+          <w:b w:val="0"/>
+          <w:i w:val="0"/>
+          <w:color w:val="0F1B33"/>
+          <w:sz w:val="8"/>
+        </w:rPr>
+      </w:r>
+    </w:p>
+    <w:tbl>
+      <w:tblPr>
+        <w:tblW w:type="auto" w:w="0"/>
+        <w:tblLayout w:type="fixed"/>
+        <w:tblLook w:firstColumn="1" w:firstRow="1" w:lastColumn="0" w:lastRow="0" w:noHBand="0" w:noVBand="1" w:val="04A0"/>
+        <w:tblLayout w:type="fixed"/>
+      </w:tblPr>
+      <w:tblGrid>
+        <w:gridCol w:w="1134"/>
+        <w:gridCol w:w="14003"/>
+      </w:tblGrid>
+      <w:tr>
+        <w:tc>
+          <w:tcPr>
+            <w:tcW w:type="dxa" w:w="1134"/>
+          </w:tcPr>
+          <w:p>
+            <w:pPr>
+              <w:spacing w:before="120"/>
+            </w:pPr>
+            <w:r>
+              <w:rPr>
+                <w:b/>
+                <w:color w:val="C97C00"/>
+                <w:sz w:val="52"/>
+              </w:rPr>
+              <w:t>3</w:t>
+            </w:r>
+          </w:p>
+        </w:tc>
+        <w:tc>
+          <w:tcPr>
+            <w:tcW w:type="dxa" w:w="14003"/>
+          </w:tcPr>
+          <w:p>
+            <w:pPr>
+              <w:spacing w:before="40" w:after="0"/>
+            </w:pPr>
+            <w:r>
+              <w:drawing>
+                <wp:inline xmlns:a="http://schemas.openxmlformats.org/drawingml/2006/main" xmlns:pic="http://schemas.openxmlformats.org/drawingml/2006/picture">
+                  <wp:extent cx="5867354" cy="2304000"/>
+                  <wp:docPr id="29" name="Picture 29"/>
+                  <wp:cNvGraphicFramePr>
+                    <a:graphicFrameLocks noChangeAspect="1"/>
+                  </wp:cNvGraphicFramePr>
+                  <a:graphic>
+                    <a:graphicData uri="http://schemas.openxmlformats.org/drawingml/2006/picture">
+                      <pic:pic>
+                        <pic:nvPicPr>
+                          <pic:cNvPr id="0" name="m03.png"/>
+                          <pic:cNvPicPr/>
+                        </pic:nvPicPr>
+                        <pic:blipFill>
+                          <a:blip r:embed="rId37"/>
+                          <a:stretch>
+                            <a:fillRect/>
+                          </a:stretch>
+                        </pic:blipFill>
+                        <pic:spPr>
+                          <a:xfrm>
+                            <a:off x="0" y="0"/>
+                            <a:ext cx="5867354" cy="2304000"/>
+                          </a:xfrm>
+                          <a:prstGeom prst="rect"/>
+                        </pic:spPr>
+                      </pic:pic>
+                    </a:graphicData>
+                  </a:graphic>
+                </wp:inline>
+              </w:drawing>
+            </w:r>
+          </w:p>
+        </w:tc>
+      </w:tr>
+      <w:tr>
+        <w:tc>
+          <w:tcPr>
+            <w:tcW w:type="dxa" w:w="1134"/>
+          </w:tcPr>
+          <w:p>
+            <w:pPr>
+              <w:spacing w:before="120"/>
+            </w:pPr>
+            <w:r>
+              <w:rPr>
+                <w:b/>
+                <w:color w:val="C97C00"/>
+                <w:sz w:val="52"/>
+              </w:rPr>
+              <w:t>4</w:t>
+            </w:r>
+          </w:p>
+        </w:tc>
+        <w:tc>
+          <w:tcPr>
+            <w:tcW w:type="dxa" w:w="14003"/>
+          </w:tcPr>
+          <w:p>
+            <w:pPr>
+              <w:spacing w:before="40" w:after="0"/>
+            </w:pPr>
+            <w:r>
+              <w:drawing>
+                <wp:inline xmlns:a="http://schemas.openxmlformats.org/drawingml/2006/main" xmlns:pic="http://schemas.openxmlformats.org/drawingml/2006/picture">
+                  <wp:extent cx="7254709" cy="2304000"/>
+                  <wp:docPr id="30" name="Picture 30"/>
+                  <wp:cNvGraphicFramePr>
+                    <a:graphicFrameLocks noChangeAspect="1"/>
+                  </wp:cNvGraphicFramePr>
+                  <a:graphic>
+                    <a:graphicData uri="http://schemas.openxmlformats.org/drawingml/2006/picture">
+                      <pic:pic>
+                        <pic:nvPicPr>
+                          <pic:cNvPr id="0" name="m04.png"/>
+                          <pic:cNvPicPr/>
+                        </pic:nvPicPr>
+                        <pic:blipFill>
+                          <a:blip r:embed="rId38"/>
+                          <a:stretch>
+                            <a:fillRect/>
+                          </a:stretch>
+                        </pic:blipFill>
+                        <pic:spPr>
+                          <a:xfrm>
+                            <a:off x="0" y="0"/>
+                            <a:ext cx="7254709" cy="2304000"/>
+                          </a:xfrm>
+                          <a:prstGeom prst="rect"/>
+                        </pic:spPr>
+                      </pic:pic>
+                    </a:graphicData>
+                  </a:graphic>
+                </wp:inline>
+              </w:drawing>
+            </w:r>
+          </w:p>
+        </w:tc>
+      </w:tr>
+    </w:tbl>
+    <w:p>
+      <w:pPr>
+        <w:spacing w:before="120" w:after="0"/>
+      </w:pPr>
+      <w:r>
+        <w:rPr>
+          <w:b w:val="0"/>
+          <w:i/>
+          <w:color w:val="0F1B33"/>
+          <w:sz w:val="28"/>
+        </w:rPr>
+        <w:t>Treble key:  lines E G B D F  |  spaces F A C E     Bass key:  lines G B D F A  |  spaces A C E G</w:t>
+      </w:r>
+    </w:p>
+    <w:p>
+      <w:pPr>
+        <w:rPr>
+          <w:sz w:val="2"/>
+        </w:rPr>
+      </w:pPr>
+      <w:r>
+        <w:rPr>
+          <w:sz w:val="2"/>
+        </w:rPr>
+        <w:br w:type="page"/>
+      </w:r>
+    </w:p>
+    <w:tbl>
+      <w:tblPr>
+        <w:tblW w:type="auto" w:w="0"/>
+        <w:tblLayout w:type="fixed"/>
+        <w:tblLook w:firstColumn="1" w:firstRow="1" w:lastColumn="0" w:lastRow="0" w:noHBand="0" w:noVBand="1" w:val="04A0"/>
+        <w:tblLayout w:type="fixed"/>
+      </w:tblPr>
+      <w:tblGrid>
+        <w:gridCol w:w="10318"/>
+        <w:gridCol w:w="4819"/>
+      </w:tblGrid>
+      <w:tr>
+        <w:tc>
+          <w:tcPr>
+            <w:tcW w:type="dxa" w:w="10318"/>
+          </w:tcPr>
+          <w:p>
+            <w:r>
+              <w:rPr>
+                <w:b/>
+                <w:sz w:val="68"/>
+              </w:rPr>
+              <w:t>Mixed clefs: codes 5 and 6</w:t>
+            </w:r>
+          </w:p>
+          <w:p>
+            <w:r>
+              <w:rPr>
+                <w:b/>
+                <w:color w:val="C97C00"/>
+                <w:sz w:val="36"/>
+              </w:rPr>
+              <w:t>The clef changes halfway. Check each one!</w:t>
+            </w:r>
+          </w:p>
+        </w:tc>
+        <w:tc>
+          <w:tcPr>
+            <w:tcW w:type="dxa" w:w="4819"/>
+          </w:tcPr>
+          <w:p>
+            <w:pPr>
+              <w:spacing w:before="200"/>
+              <w:jc w:val="right"/>
+            </w:pPr>
+            <w:r>
+              <w:rPr>
+                <w:sz w:val="40"/>
+              </w:rPr>
+              <w:t>Name: ______________</w:t>
+            </w:r>
+          </w:p>
+        </w:tc>
+      </w:tr>
+    </w:tbl>
+    <w:p>
+      <w:pPr>
+        <w:spacing w:before="0" w:after="0"/>
+      </w:pPr>
+      <w:r>
+        <w:rPr>
+          <w:b w:val="0"/>
+          <w:i w:val="0"/>
+          <w:color w:val="0F1B33"/>
+          <w:sz w:val="8"/>
+        </w:rPr>
+      </w:r>
+    </w:p>
+    <w:tbl>
+      <w:tblPr>
+        <w:tblW w:type="auto" w:w="0"/>
+        <w:tblLayout w:type="fixed"/>
+        <w:tblLook w:firstColumn="1" w:firstRow="1" w:lastColumn="0" w:lastRow="0" w:noHBand="0" w:noVBand="1" w:val="04A0"/>
+        <w:tblLayout w:type="fixed"/>
+      </w:tblPr>
+      <w:tblGrid>
+        <w:gridCol w:w="1134"/>
+        <w:gridCol w:w="14003"/>
+      </w:tblGrid>
+      <w:tr>
+        <w:tc>
+          <w:tcPr>
+            <w:tcW w:type="dxa" w:w="1134"/>
+          </w:tcPr>
+          <w:p>
+            <w:pPr>
+              <w:spacing w:before="120"/>
+            </w:pPr>
+            <w:r>
+              <w:rPr>
+                <w:b/>
+                <w:color w:val="C97C00"/>
+                <w:sz w:val="52"/>
+              </w:rPr>
+              <w:t>5</w:t>
+            </w:r>
+          </w:p>
+        </w:tc>
+        <w:tc>
+          <w:tcPr>
+            <w:tcW w:type="dxa" w:w="14003"/>
+          </w:tcPr>
+          <w:p>
+            <w:pPr>
+              <w:spacing w:before="40" w:after="0"/>
+            </w:pPr>
+            <w:r>
+              <w:drawing>
+                <wp:inline xmlns:a="http://schemas.openxmlformats.org/drawingml/2006/main" xmlns:pic="http://schemas.openxmlformats.org/drawingml/2006/picture">
+                  <wp:extent cx="5867354" cy="2304000"/>
+                  <wp:docPr id="31" name="Picture 31"/>
+                  <wp:cNvGraphicFramePr>
+                    <a:graphicFrameLocks noChangeAspect="1"/>
+                  </wp:cNvGraphicFramePr>
+                  <a:graphic>
+                    <a:graphicData uri="http://schemas.openxmlformats.org/drawingml/2006/picture">
+                      <pic:pic>
+                        <pic:nvPicPr>
+                          <pic:cNvPr id="0" name="m05.png"/>
+                          <pic:cNvPicPr/>
+                        </pic:nvPicPr>
+                        <pic:blipFill>
+                          <a:blip r:embed="rId39"/>
+                          <a:stretch>
+                            <a:fillRect/>
+                          </a:stretch>
+                        </pic:blipFill>
+                        <pic:spPr>
+                          <a:xfrm>
+                            <a:off x="0" y="0"/>
+                            <a:ext cx="5867354" cy="2304000"/>
+                          </a:xfrm>
+                          <a:prstGeom prst="rect"/>
+                        </pic:spPr>
+                      </pic:pic>
+                    </a:graphicData>
+                  </a:graphic>
+                </wp:inline>
+              </w:drawing>
+            </w:r>
+          </w:p>
+        </w:tc>
+      </w:tr>
+      <w:tr>
+        <w:tc>
+          <w:tcPr>
+            <w:tcW w:type="dxa" w:w="1134"/>
+          </w:tcPr>
+          <w:p>
+            <w:pPr>
+              <w:spacing w:before="120"/>
+            </w:pPr>
+            <w:r>
+              <w:rPr>
+                <w:b/>
+                <w:color w:val="C97C00"/>
+                <w:sz w:val="52"/>
+              </w:rPr>
+              <w:t>6</w:t>
+            </w:r>
+          </w:p>
+        </w:tc>
+        <w:tc>
+          <w:tcPr>
+            <w:tcW w:type="dxa" w:w="14003"/>
+          </w:tcPr>
+          <w:p>
+            <w:pPr>
+              <w:spacing w:before="40" w:after="0"/>
+            </w:pPr>
+            <w:r>
+              <w:drawing>
+                <wp:inline xmlns:a="http://schemas.openxmlformats.org/drawingml/2006/main" xmlns:pic="http://schemas.openxmlformats.org/drawingml/2006/picture">
+                  <wp:extent cx="5867354" cy="2304000"/>
+                  <wp:docPr id="32" name="Picture 32"/>
+                  <wp:cNvGraphicFramePr>
+                    <a:graphicFrameLocks noChangeAspect="1"/>
+                  </wp:cNvGraphicFramePr>
+                  <a:graphic>
+                    <a:graphicData uri="http://schemas.openxmlformats.org/drawingml/2006/picture">
+                      <pic:pic>
+                        <pic:nvPicPr>
+                          <pic:cNvPr id="0" name="m06.png"/>
+                          <pic:cNvPicPr/>
+                        </pic:nvPicPr>
+                        <pic:blipFill>
+                          <a:blip r:embed="rId40"/>
+                          <a:stretch>
+                            <a:fillRect/>
+                          </a:stretch>
+                        </pic:blipFill>
+                        <pic:spPr>
+                          <a:xfrm>
+                            <a:off x="0" y="0"/>
+                            <a:ext cx="5867354" cy="2304000"/>
+                          </a:xfrm>
+                          <a:prstGeom prst="rect"/>
+                        </pic:spPr>
+                      </pic:pic>
+                    </a:graphicData>
+                  </a:graphic>
+                </wp:inline>
+              </w:drawing>
+            </w:r>
+          </w:p>
+        </w:tc>
+      </w:tr>
+    </w:tbl>
+    <w:p>
+      <w:pPr>
+        <w:spacing w:before="120" w:after="0"/>
+      </w:pPr>
+      <w:r>
+        <w:rPr>
+          <w:b w:val="0"/>
+          <w:i/>
+          <w:color w:val="0F1B33"/>
+          <w:sz w:val="28"/>
+        </w:rPr>
+        <w:t>Treble key:  lines E G B D F  |  spaces F A C E     Bass key:  lines G B D F A  |  spaces A C E G</w:t>
+      </w:r>
+    </w:p>
+    <w:p>
+      <w:pPr>
+        <w:rPr>
+          <w:sz w:val="2"/>
+        </w:rPr>
+      </w:pPr>
+      <w:r>
+        <w:rPr>
+          <w:sz w:val="2"/>
+        </w:rPr>
+        <w:br w:type="page"/>
+      </w:r>
+    </w:p>
+    <w:tbl>
+      <w:tblPr>
+        <w:tblW w:type="auto" w:w="0"/>
+        <w:tblLayout w:type="fixed"/>
+        <w:tblLook w:firstColumn="1" w:firstRow="1" w:lastColumn="0" w:lastRow="0" w:noHBand="0" w:noVBand="1" w:val="04A0"/>
+        <w:tblLayout w:type="fixed"/>
+      </w:tblPr>
+      <w:tblGrid>
+        <w:gridCol w:w="10318"/>
+        <w:gridCol w:w="4819"/>
+      </w:tblGrid>
+      <w:tr>
+        <w:tc>
+          <w:tcPr>
+            <w:tcW w:type="dxa" w:w="10318"/>
+          </w:tcPr>
+          <w:p>
+            <w:r>
+              <w:rPr>
+                <w:b/>
+                <w:sz w:val="68"/>
+              </w:rPr>
+              <w:t>Mixed clefs: codes 7 and 8</w:t>
+            </w:r>
+          </w:p>
+          <w:p>
+            <w:r>
+              <w:rPr>
+                <w:b/>
+                <w:color w:val="C97C00"/>
+                <w:sz w:val="36"/>
+              </w:rPr>
+              <w:t>The clef changes halfway. Check each one!</w:t>
+            </w:r>
+          </w:p>
+        </w:tc>
+        <w:tc>
+          <w:tcPr>
+            <w:tcW w:type="dxa" w:w="4819"/>
+          </w:tcPr>
+          <w:p>
+            <w:pPr>
+              <w:spacing w:before="200"/>
+              <w:jc w:val="right"/>
+            </w:pPr>
+            <w:r>
+              <w:rPr>
+                <w:sz w:val="40"/>
+              </w:rPr>
+              <w:t>Name: ______________</w:t>
+            </w:r>
+          </w:p>
+        </w:tc>
+      </w:tr>
+    </w:tbl>
+    <w:p>
+      <w:pPr>
+        <w:spacing w:before="0" w:after="0"/>
+      </w:pPr>
+      <w:r>
+        <w:rPr>
+          <w:b w:val="0"/>
+          <w:i w:val="0"/>
+          <w:color w:val="0F1B33"/>
+          <w:sz w:val="8"/>
+        </w:rPr>
+      </w:r>
+    </w:p>
+    <w:tbl>
+      <w:tblPr>
+        <w:tblW w:type="auto" w:w="0"/>
+        <w:tblLayout w:type="fixed"/>
+        <w:tblLook w:firstColumn="1" w:firstRow="1" w:lastColumn="0" w:lastRow="0" w:noHBand="0" w:noVBand="1" w:val="04A0"/>
+        <w:tblLayout w:type="fixed"/>
+      </w:tblPr>
+      <w:tblGrid>
+        <w:gridCol w:w="1134"/>
+        <w:gridCol w:w="14003"/>
+      </w:tblGrid>
+      <w:tr>
+        <w:tc>
+          <w:tcPr>
+            <w:tcW w:type="dxa" w:w="1134"/>
+          </w:tcPr>
+          <w:p>
+            <w:pPr>
+              <w:spacing w:before="120"/>
+            </w:pPr>
+            <w:r>
+              <w:rPr>
+                <w:b/>
+                <w:color w:val="C97C00"/>
+                <w:sz w:val="52"/>
+              </w:rPr>
+              <w:t>7</w:t>
+            </w:r>
+          </w:p>
+        </w:tc>
+        <w:tc>
+          <w:tcPr>
+            <w:tcW w:type="dxa" w:w="14003"/>
+          </w:tcPr>
+          <w:p>
+            <w:pPr>
+              <w:spacing w:before="40" w:after="0"/>
+            </w:pPr>
+            <w:r>
+              <w:drawing>
+                <wp:inline xmlns:a="http://schemas.openxmlformats.org/drawingml/2006/main" xmlns:pic="http://schemas.openxmlformats.org/drawingml/2006/picture">
+                  <wp:extent cx="6561032" cy="2304000"/>
+                  <wp:docPr id="33" name="Picture 33"/>
+                  <wp:cNvGraphicFramePr>
+                    <a:graphicFrameLocks noChangeAspect="1"/>
+                  </wp:cNvGraphicFramePr>
+                  <a:graphic>
+                    <a:graphicData uri="http://schemas.openxmlformats.org/drawingml/2006/picture">
+                      <pic:pic>
+                        <pic:nvPicPr>
+                          <pic:cNvPr id="0" name="m07.png"/>
+                          <pic:cNvPicPr/>
+                        </pic:nvPicPr>
+                        <pic:blipFill>
+                          <a:blip r:embed="rId41"/>
+                          <a:stretch>
+                            <a:fillRect/>
+                          </a:stretch>
+                        </pic:blipFill>
+                        <pic:spPr>
+                          <a:xfrm>
+                            <a:off x="0" y="0"/>
+                            <a:ext cx="6561032" cy="2304000"/>
+                          </a:xfrm>
+                          <a:prstGeom prst="rect"/>
+                        </pic:spPr>
+                      </pic:pic>
+                    </a:graphicData>
+                  </a:graphic>
+                </wp:inline>
+              </w:drawing>
+            </w:r>
+          </w:p>
+        </w:tc>
+      </w:tr>
+      <w:tr>
+        <w:tc>
+          <w:tcPr>
+            <w:tcW w:type="dxa" w:w="1134"/>
+          </w:tcPr>
+          <w:p>
+            <w:pPr>
+              <w:spacing w:before="120"/>
+            </w:pPr>
+            <w:r>
+              <w:rPr>
+                <w:b/>
+                <w:color w:val="C97C00"/>
+                <w:sz w:val="52"/>
+              </w:rPr>
+              <w:t>8</w:t>
+            </w:r>
+          </w:p>
+        </w:tc>
+        <w:tc>
+          <w:tcPr>
+            <w:tcW w:type="dxa" w:w="14003"/>
+          </w:tcPr>
+          <w:p>
+            <w:pPr>
+              <w:spacing w:before="40" w:after="0"/>
+            </w:pPr>
+            <w:r>
+              <w:drawing>
+                <wp:inline xmlns:a="http://schemas.openxmlformats.org/drawingml/2006/main" xmlns:pic="http://schemas.openxmlformats.org/drawingml/2006/picture">
+                  <wp:extent cx="6561032" cy="2304000"/>
+                  <wp:docPr id="34" name="Picture 34"/>
+                  <wp:cNvGraphicFramePr>
+                    <a:graphicFrameLocks noChangeAspect="1"/>
+                  </wp:cNvGraphicFramePr>
+                  <a:graphic>
+                    <a:graphicData uri="http://schemas.openxmlformats.org/drawingml/2006/picture">
+                      <pic:pic>
+                        <pic:nvPicPr>
+                          <pic:cNvPr id="0" name="m08.png"/>
+                          <pic:cNvPicPr/>
+                        </pic:nvPicPr>
+                        <pic:blipFill>
+                          <a:blip r:embed="rId42"/>
+                          <a:stretch>
+                            <a:fillRect/>
+                          </a:stretch>
+                        </pic:blipFill>
+                        <pic:spPr>
+                          <a:xfrm>
+                            <a:off x="0" y="0"/>
+                            <a:ext cx="6561032" cy="2304000"/>
+                          </a:xfrm>
+                          <a:prstGeom prst="rect"/>
+                        </pic:spPr>
+                      </pic:pic>
+                    </a:graphicData>
+                  </a:graphic>
+                </wp:inline>
+              </w:drawing>
+            </w:r>
+          </w:p>
+        </w:tc>
+      </w:tr>
+    </w:tbl>
+    <w:p>
+      <w:pPr>
+        <w:spacing w:before="120" w:after="0"/>
+      </w:pPr>
+      <w:r>
+        <w:rPr>
+          <w:b w:val="0"/>
+          <w:i/>
+          <w:color w:val="0F1B33"/>
+          <w:sz w:val="28"/>
+        </w:rPr>
+        <w:t>Treble key:  lines E G B D F  |  spaces F A C E     Bass key:  lines G B D F A  |  spaces A C E G</w:t>
+      </w:r>
+    </w:p>
     <w:sectPr>
       <w:pgSz w:w="16838" w:h="11906" w:orient="landscape"/>
       <w:pgMar w:top="567" w:right="850" w:bottom="454" w:left="850" w:header="720" w:footer="720" w:gutter="0"/>

</xml_diff>